<commit_message>
Rebuild final report PDF/DOCX and package zip
Co-Authored-By: Claude Opus 5.5 <noreply@anthropic.com>
Claude-Session: https://claude.ai/code/session_013jcZrhQuTopEdkJ4pmS4yQ
</commit_message>
<xml_diff>
--- a/CSE410_Lab_DIVA_MobSF/Report/CSE410_DIVA_MobSF_Lab_Report.docx
+++ b/CSE410_Lab_DIVA_MobSF/Report/CSE410_DIVA_MobSF_Lab_Report.docx
@@ -55,6 +55,18 @@
     <w:p>
       <w:pPr>
         <w:pStyle w:val="FirstParagraph"/>
+      </w:pPr>
+      <w:r>
+        <w:rPr>
+          <w:iCs/>
+          <w:i/>
+        </w:rPr>
+        <w:t xml:space="preserve">1. Cover Page</w:t>
+      </w:r>
+    </w:p>
+    <w:p>
+      <w:pPr>
+        <w:pStyle w:val="BodyText"/>
       </w:pPr>
       <w:r>
         <w:rPr>
@@ -1361,7 +1373,7 @@
       </w:tr>
     </w:tbl>
     <w:bookmarkEnd w:id="23"/>
-    <w:bookmarkStart w:id="33" w:name="tools-and-environment"/>
+    <w:bookmarkStart w:id="34" w:name="tools-and-environment"/>
     <w:p>
       <w:pPr>
         <w:pStyle w:val="Heading1"/>
@@ -2148,22 +2160,69 @@
               <w:rPr>
                 <w:sz w:val="17"/>
               </w:rPr>
-              <w:t xml:space="preserve">Chromium (Playwright)</w:t>
-            </w:r>
-          </w:p>
-        </w:tc>
-        <w:tc>
-          <w:tcPr/>
-          <w:p>
-            <w:pPr>
-              <w:pStyle w:val="Compact"/>
-              <w:jc w:val="left"/>
-            </w:pPr>
-            <w:r>
-              <w:rPr>
-                <w:sz w:val="17"/>
-              </w:rPr>
-              <w:t xml:space="preserve">MobSF web interface &amp; screenshots</w:t>
+              <w:t xml:space="preserve">Chromium</w:t>
+            </w:r>
+          </w:p>
+        </w:tc>
+        <w:tc>
+          <w:tcPr/>
+          <w:p>
+            <w:pPr>
+              <w:pStyle w:val="Compact"/>
+              <w:jc w:val="left"/>
+            </w:pPr>
+            <w:r>
+              <w:rPr>
+                <w:sz w:val="17"/>
+              </w:rPr>
+              <w:t xml:space="preserve">MobSF web interface and screenshots</w:t>
+            </w:r>
+          </w:p>
+        </w:tc>
+      </w:tr>
+      <w:tr>
+        <w:tc>
+          <w:tcPr/>
+          <w:p>
+            <w:pPr>
+              <w:pStyle w:val="Compact"/>
+              <w:jc w:val="left"/>
+            </w:pPr>
+            <w:r>
+              <w:rPr>
+                <w:sz w:val="17"/>
+              </w:rPr>
+              <w:t xml:space="preserve">AI coding assistant</w:t>
+            </w:r>
+          </w:p>
+        </w:tc>
+        <w:tc>
+          <w:tcPr/>
+          <w:p>
+            <w:pPr>
+              <w:pStyle w:val="Compact"/>
+              <w:jc w:val="left"/>
+            </w:pPr>
+            <w:r>
+              <w:rPr>
+                <w:sz w:val="17"/>
+              </w:rPr>
+              <w:t xml:space="preserve">Claude Code (permitted by Section 5 of the lab sheet)</w:t>
+            </w:r>
+          </w:p>
+        </w:tc>
+        <w:tc>
+          <w:tcPr/>
+          <w:p>
+            <w:pPr>
+              <w:pStyle w:val="Compact"/>
+              <w:jc w:val="left"/>
+            </w:pPr>
+            <w:r>
+              <w:rPr>
+                <w:sz w:val="17"/>
+              </w:rPr>
+              <w:t xml:space="preserve">Help running the commands, capturing evidence and drafting text (see 5.1)</w:t>
             </w:r>
           </w:p>
         </w:tc>
@@ -2325,8 +2384,38 @@
         <w:t xml:space="preserve">.</w:t>
       </w:r>
     </w:p>
+    <w:bookmarkStart w:id="33" w:name="use-of-ai-tools"/>
+    <w:p>
+      <w:pPr>
+        <w:pStyle w:val="Heading2"/>
+      </w:pPr>
+      <w:r>
+        <w:t xml:space="preserve">5.1 Use of AI tools</w:t>
+      </w:r>
+    </w:p>
+    <w:p>
+      <w:pPr>
+        <w:pStyle w:val="FirstParagraph"/>
+      </w:pPr>
+      <w:r>
+        <w:t xml:space="preserve">Section 5 of the lab sheet allows students to use an AI coding tool (Claude Code, Codex, Copilot, etc.) to complete the whole task. Claude Code was used to run the build and Docker commands on the lab host, to drive the MobSF web interface and capture the screenshots, and to help draft this report. Every command output, screenshot, MobSF result and report export in this document comes from that real run against the student-built APK; nothing was invented. File paths in some terminal screenshots (for example</w:t>
+      </w:r>
+      <w:r>
+        <w:t xml:space="preserve"> </w:t>
+      </w:r>
+      <w:r>
+        <w:rPr>
+          <w:rStyle w:val="VerbatimChar"/>
+        </w:rPr>
+        <w:t xml:space="preserve">/tmp/claude-0/work/out/</w:t>
+      </w:r>
+      <w:r>
+        <w:t xml:space="preserve">) are the tool’s working folder on the lab host. The student reviewed every finding, checked each code location against the DIVA source, and can explain and demonstrate the work (Stage 6).</w:t>
+      </w:r>
+    </w:p>
     <w:bookmarkEnd w:id="33"/>
-    <w:bookmarkStart w:id="51" w:name="diva-application-preparation-stage-1"/>
+    <w:bookmarkEnd w:id="34"/>
+    <w:bookmarkStart w:id="52" w:name="diva-application-preparation-stage-1"/>
     <w:p>
       <w:pPr>
         <w:pStyle w:val="Heading1"/>
@@ -2335,7 +2424,7 @@
         <w:t xml:space="preserve">6. DIVA Application Preparation (Stage 1)</w:t>
       </w:r>
     </w:p>
-    <w:bookmarkStart w:id="37" w:name="step-1.1-obtaining-the-source"/>
+    <w:bookmarkStart w:id="38" w:name="step-1.1-obtaining-the-source"/>
     <w:p>
       <w:pPr>
         <w:pStyle w:val="Heading2"/>
@@ -2485,18 +2574,18 @@
           <wp:inline>
             <wp:extent cx="5334000" cy="1641230"/>
             <wp:effectExtent b="0" l="0" r="0" t="0"/>
-            <wp:docPr descr="Figure 1. Official DIVA source cloned from github.com/payatu/diva-android. The figure shows the commit and the SDK/dependency settings in app/build.gradle (applicationId jakhar.aseem.diva, minSdk 15, targetSdk 23, support library 23.1.0)." title="" id="35" name="Picture"/>
+            <wp:docPr descr="Figure 1. Official DIVA source cloned from github.com/payatu/diva-android. The figure shows the commit and the SDK/dependency settings in app/build.gradle (applicationId jakhar.aseem.diva, minSdk 15, targetSdk 23, support library 23.1.0)." title="" id="36" name="Picture"/>
             <a:graphic>
               <a:graphicData uri="http://schemas.openxmlformats.org/drawingml/2006/picture">
                 <pic:pic>
                   <pic:nvPicPr>
-                    <pic:cNvPr descr="../Screenshots/01_stage1_diva_source_clone.png" id="36" name="Picture"/>
+                    <pic:cNvPr descr="../Screenshots/01_stage1_diva_source_clone.png" id="37" name="Picture"/>
                     <pic:cNvPicPr>
                       <a:picLocks noChangeArrowheads="1" noChangeAspect="1"/>
                     </pic:cNvPicPr>
                   </pic:nvPicPr>
                   <pic:blipFill>
-                    <a:blip r:embed="rId34"/>
+                    <a:blip r:embed="rId35"/>
                     <a:stretch>
                       <a:fillRect/>
                     </a:stretch>
@@ -2558,8 +2647,8 @@
         <w:t xml:space="preserve">, minSdk 15, targetSdk 23, support library 23.1.0).</w:t>
       </w:r>
     </w:p>
-    <w:bookmarkEnd w:id="37"/>
-    <w:bookmarkStart w:id="38" w:name="X2342e481f02440949e576fa0d48b5114c128184"/>
+    <w:bookmarkEnd w:id="38"/>
+    <w:bookmarkStart w:id="39" w:name="X2342e481f02440949e576fa0d48b5114c128184"/>
     <w:p>
       <w:pPr>
         <w:pStyle w:val="Heading2"/>
@@ -3033,7 +3122,7 @@
           <w:bCs/>
           <w:b/>
         </w:rPr>
-        <w:t xml:space="preserve">Insert screenshot — Figure 2.</w:t>
+        <w:t xml:space="preserve">Figure 2 — screenshot to insert.</w:t>
       </w:r>
       <w:r>
         <w:t xml:space="preserve"> </w:t>
@@ -3070,8 +3159,8 @@
         <w:t xml:space="preserve">in Section 5.</w:t>
       </w:r>
     </w:p>
-    <w:bookmarkEnd w:id="38"/>
-    <w:bookmarkStart w:id="42" w:name="step-1.3-preparing-the-native-component"/>
+    <w:bookmarkEnd w:id="39"/>
+    <w:bookmarkStart w:id="43" w:name="step-1.3-preparing-the-native-component"/>
     <w:p>
       <w:pPr>
         <w:pStyle w:val="Heading2"/>
@@ -3259,18 +3348,18 @@
           <wp:inline>
             <wp:extent cx="5334000" cy="2327812"/>
             <wp:effectExtent b="0" l="0" r="0" t="0"/>
-            <wp:docPr descr="Figure 3. make in app/src/main/jni compiled libdivajni.so for armeabi-v7a, arm64-v8a, x86, x86_64 and riscv64 and copied the libraries into jniLibs/." title="" id="40" name="Picture"/>
+            <wp:docPr descr="Figure 3. make in app/src/main/jni compiled libdivajni.so for armeabi-v7a, arm64-v8a, x86, x86_64 and riscv64 and copied the libraries into jniLibs/." title="" id="41" name="Picture"/>
             <a:graphic>
               <a:graphicData uri="http://schemas.openxmlformats.org/drawingml/2006/picture">
                 <pic:pic>
                   <pic:nvPicPr>
-                    <pic:cNvPr descr="../Screenshots/02_stage1_native_make.png" id="41" name="Picture"/>
+                    <pic:cNvPr descr="../Screenshots/02_stage1_native_make.png" id="42" name="Picture"/>
                     <pic:cNvPicPr>
                       <a:picLocks noChangeArrowheads="1" noChangeAspect="1"/>
                     </pic:cNvPicPr>
                   </pic:nvPicPr>
                   <pic:blipFill>
-                    <a:blip r:embed="rId39"/>
+                    <a:blip r:embed="rId40"/>
                     <a:stretch>
                       <a:fillRect/>
                     </a:stretch>
@@ -3395,8 +3484,8 @@
         <w:t xml:space="preserve">is 15. This does not affect static analysis.</w:t>
       </w:r>
     </w:p>
-    <w:bookmarkEnd w:id="42"/>
-    <w:bookmarkStart w:id="46" w:name="step-1.4-building-the-application"/>
+    <w:bookmarkEnd w:id="43"/>
+    <w:bookmarkStart w:id="47" w:name="step-1.4-building-the-application"/>
     <w:p>
       <w:pPr>
         <w:pStyle w:val="Heading2"/>
@@ -3410,7 +3499,32 @@
         <w:pStyle w:val="FirstParagraph"/>
       </w:pPr>
       <w:r>
-        <w:t xml:space="preserve">In Android Studio, the build is</w:t>
+        <w:t xml:space="preserve">Step 1.4 asks for</w:t>
+      </w:r>
+      <w:r>
+        <w:t xml:space="preserve"> </w:t>
+      </w:r>
+      <w:r>
+        <w:rPr>
+          <w:iCs/>
+          <w:i/>
+        </w:rPr>
+        <w:t xml:space="preserve">Build → Make Project</w:t>
+      </w:r>
+      <w:r>
+        <w:t xml:space="preserve"> </w:t>
+      </w:r>
+      <w:r>
+        <w:t xml:space="preserve">“</w:t>
+      </w:r>
+      <w:r>
+        <w:t xml:space="preserve">or the equivalent build action in your installed version</w:t>
+      </w:r>
+      <w:r>
+        <w:t xml:space="preserve">”</w:t>
+      </w:r>
+      <w:r>
+        <w:t xml:space="preserve">. In Android Studio, the build is</w:t>
       </w:r>
       <w:r>
         <w:t xml:space="preserve"> </w:t>
@@ -3612,18 +3726,18 @@
           <wp:inline>
             <wp:extent cx="5334000" cy="1641230"/>
             <wp:effectExtent b="0" l="0" r="0" t="0"/>
-            <wp:docPr descr="Figure 4. Successful build of the DIVA debug APK (BUILD SUCCESSFUL). It shows the seven build stages, the debug-signing certificate and the SHA-256 of the output." title="" id="44" name="Picture"/>
+            <wp:docPr descr="Figure 4. Successful build of the DIVA debug APK (BUILD SUCCESSFUL). It shows the seven build stages, the debug-signing certificate and the SHA-256 of the output." title="" id="45" name="Picture"/>
             <a:graphic>
               <a:graphicData uri="http://schemas.openxmlformats.org/drawingml/2006/picture">
                 <pic:pic>
                   <pic:nvPicPr>
-                    <pic:cNvPr descr="../Screenshots/03_stage1_apk_build_success.png" id="45" name="Picture"/>
+                    <pic:cNvPr descr="../Screenshots/03_stage1_apk_build_success.png" id="46" name="Picture"/>
                     <pic:cNvPicPr>
                       <a:picLocks noChangeArrowheads="1" noChangeAspect="1"/>
                     </pic:cNvPicPr>
                   </pic:nvPicPr>
                   <pic:blipFill>
-                    <a:blip r:embed="rId43"/>
+                    <a:blip r:embed="rId44"/>
                     <a:stretch>
                       <a:fillRect/>
                     </a:stretch>
@@ -3676,7 +3790,7 @@
           <w:bCs/>
           <w:b/>
         </w:rPr>
-        <w:t xml:space="preserve">Insert screenshot — Figure 5.</w:t>
+        <w:t xml:space="preserve">Figure 5 — screenshot to insert.</w:t>
       </w:r>
       <w:r>
         <w:t xml:space="preserve"> </w:t>
@@ -3770,8 +3884,8 @@
         <w:t xml:space="preserve">.</w:t>
       </w:r>
     </w:p>
-    <w:bookmarkEnd w:id="46"/>
-    <w:bookmarkStart w:id="50" w:name="step-1.5-assessment-environment-record"/>
+    <w:bookmarkEnd w:id="47"/>
+    <w:bookmarkStart w:id="51" w:name="step-1.5-assessment-environment-record"/>
     <w:p>
       <w:pPr>
         <w:pStyle w:val="Heading2"/>
@@ -4249,18 +4363,18 @@
           <wp:inline>
             <wp:extent cx="5334000" cy="1879209"/>
             <wp:effectExtent b="0" l="0" r="0" t="0"/>
-            <wp:docPr descr="Figure 6. Generated APK checked with aapt2 dump badging: package jakhar.aseem.diva, SDK levels, permissions, classes.dex, resources.arsc and the bundled native libraries." title="" id="48" name="Picture"/>
+            <wp:docPr descr="Figure 6. Generated APK checked with aapt2 dump badging: package jakhar.aseem.diva, SDK levels, permissions, classes.dex, resources.arsc and the bundled native libraries." title="" id="49" name="Picture"/>
             <a:graphic>
               <a:graphicData uri="http://schemas.openxmlformats.org/drawingml/2006/picture">
                 <pic:pic>
                   <pic:nvPicPr>
-                    <pic:cNvPr descr="../Screenshots/04_stage1_generated_apk_details.png" id="49" name="Picture"/>
+                    <pic:cNvPr descr="../Screenshots/04_stage1_generated_apk_details.png" id="50" name="Picture"/>
                     <pic:cNvPicPr>
                       <a:picLocks noChangeArrowheads="1" noChangeAspect="1"/>
                     </pic:cNvPicPr>
                   </pic:nvPicPr>
                   <pic:blipFill>
-                    <a:blip r:embed="rId47"/>
+                    <a:blip r:embed="rId48"/>
                     <a:stretch>
                       <a:fillRect/>
                     </a:stretch>
@@ -4346,9 +4460,9 @@
         <w:t xml:space="preserve">and the bundled native libraries.</w:t>
       </w:r>
     </w:p>
-    <w:bookmarkEnd w:id="50"/>
     <w:bookmarkEnd w:id="51"/>
-    <w:bookmarkStart w:id="64" w:name="mobsf-setup-stage-2"/>
+    <w:bookmarkEnd w:id="52"/>
+    <w:bookmarkStart w:id="65" w:name="mobsf-setup-stage-2"/>
     <w:p>
       <w:pPr>
         <w:pStyle w:val="Heading1"/>
@@ -4451,18 +4565,18 @@
           <wp:inline>
             <wp:extent cx="5334000" cy="1641230"/>
             <wp:effectExtent b="0" l="0" r="0" t="0"/>
-            <wp:docPr descr="Figure 7. Official MobSF image pulled from Docker Hub (Status: Downloaded newer image …)." title="" id="53" name="Picture"/>
+            <wp:docPr descr="Figure 7. Official MobSF image pulled from Docker Hub (Status: Downloaded newer image …)." title="" id="54" name="Picture"/>
             <a:graphic>
               <a:graphicData uri="http://schemas.openxmlformats.org/drawingml/2006/picture">
                 <pic:pic>
                   <pic:nvPicPr>
-                    <pic:cNvPr descr="../Screenshots/05_stage2_docker_pull_mobsf.png" id="54" name="Picture"/>
+                    <pic:cNvPr descr="../Screenshots/05_stage2_docker_pull_mobsf.png" id="55" name="Picture"/>
                     <pic:cNvPicPr>
                       <a:picLocks noChangeArrowheads="1" noChangeAspect="1"/>
                     </pic:cNvPicPr>
                   </pic:nvPicPr>
                   <pic:blipFill>
-                    <a:blip r:embed="rId52"/>
+                    <a:blip r:embed="rId53"/>
                     <a:stretch>
                       <a:fillRect/>
                     </a:stretch>
@@ -4557,18 +4671,18 @@
           <wp:inline>
             <wp:extent cx="5334000" cy="2026920"/>
             <wp:effectExtent b="0" l="0" r="0" t="0"/>
-            <wp:docPr descr="Figure 8. MobSF container start-up log: MobSF v4.6.2 banner, default credentials mobsf/mobsf, and the container listening on 0.0.0.0:8000. The REST API key is redacted." title="" id="56" name="Picture"/>
+            <wp:docPr descr="Figure 8. MobSF container start-up log: MobSF v4.6.2 banner, default credentials mobsf/mobsf, and the container listening on 0.0.0.0:8000. The REST API key is redacted." title="" id="57" name="Picture"/>
             <a:graphic>
               <a:graphicData uri="http://schemas.openxmlformats.org/drawingml/2006/picture">
                 <pic:pic>
                   <pic:nvPicPr>
-                    <pic:cNvPr descr="../Screenshots/06_stage2_docker_run_mobsf.png" id="57" name="Picture"/>
+                    <pic:cNvPr descr="../Screenshots/06_stage2_docker_run_mobsf.png" id="58" name="Picture"/>
                     <pic:cNvPicPr>
                       <a:picLocks noChangeArrowheads="1" noChangeAspect="1"/>
                     </pic:cNvPicPr>
                   </pic:nvPicPr>
                   <pic:blipFill>
-                    <a:blip r:embed="rId55"/>
+                    <a:blip r:embed="rId56"/>
                     <a:stretch>
                       <a:fillRect/>
                     </a:stretch>
@@ -4679,18 +4793,18 @@
           <wp:inline>
             <wp:extent cx="5334000" cy="3333750"/>
             <wp:effectExtent b="0" l="0" r="0" t="0"/>
-            <wp:docPr descr="Figure 9. MobSF login page at http://127.0.0.1:8000 (version 4.6.2 shown in the footer)." title="" id="59" name="Picture"/>
+            <wp:docPr descr="Figure 9. MobSF login page at http://127.0.0.1:8000 (version 4.6.2 shown in the footer)." title="" id="60" name="Picture"/>
             <a:graphic>
               <a:graphicData uri="http://schemas.openxmlformats.org/drawingml/2006/picture">
                 <pic:pic>
                   <pic:nvPicPr>
-                    <pic:cNvPr descr="../Screenshots/07_stage2_mobsf_login.png" id="60" name="Picture"/>
+                    <pic:cNvPr descr="../Screenshots/07_stage2_mobsf_login.png" id="61" name="Picture"/>
                     <pic:cNvPicPr>
                       <a:picLocks noChangeArrowheads="1" noChangeAspect="1"/>
                     </pic:cNvPicPr>
                   </pic:nvPicPr>
                   <pic:blipFill>
-                    <a:blip r:embed="rId58"/>
+                    <a:blip r:embed="rId59"/>
                     <a:stretch>
                       <a:fillRect/>
                     </a:stretch>
@@ -4774,18 +4888,18 @@
           <wp:inline>
             <wp:extent cx="5334000" cy="3333750"/>
             <wp:effectExtent b="0" l="0" r="0" t="0"/>
-            <wp:docPr descr="Figure 10. MobSF dashboard after login, ready for upload. The footer confirms “Mobile Security Framework – MobSF v4.6.2”." title="" id="62" name="Picture"/>
+            <wp:docPr descr="Figure 10. MobSF dashboard after login, ready for upload. The footer confirms “Mobile Security Framework – MobSF v4.6.2”." title="" id="63" name="Picture"/>
             <a:graphic>
               <a:graphicData uri="http://schemas.openxmlformats.org/drawingml/2006/picture">
                 <pic:pic>
                   <pic:nvPicPr>
-                    <pic:cNvPr descr="../Screenshots/08_stage2_mobsf_dashboard_v4.6.2.png" id="63" name="Picture"/>
+                    <pic:cNvPr descr="../Screenshots/08_stage2_mobsf_dashboard_v4.6.2.png" id="64" name="Picture"/>
                     <pic:cNvPicPr>
                       <a:picLocks noChangeArrowheads="1" noChangeAspect="1"/>
                     </pic:cNvPicPr>
                   </pic:nvPicPr>
                   <pic:blipFill>
-                    <a:blip r:embed="rId61"/>
+                    <a:blip r:embed="rId62"/>
                     <a:stretch>
                       <a:fillRect/>
                     </a:stretch>
@@ -4899,8 +5013,8 @@
         <w:t xml:space="preserve">and the container was restarted, because MobSF’s anti-tampering check hashes tool binaries at start-up. The scan was then repeated. On a normal student PC with internet access this happens automatically.</w:t>
       </w:r>
     </w:p>
-    <w:bookmarkEnd w:id="64"/>
-    <w:bookmarkStart w:id="95" w:name="Xe49b7a85644a008b65af5e6c570ea18ab23ab89"/>
+    <w:bookmarkEnd w:id="65"/>
+    <w:bookmarkStart w:id="96" w:name="Xe49b7a85644a008b65af5e6c570ea18ab23ab89"/>
     <w:p>
       <w:pPr>
         <w:pStyle w:val="Heading1"/>
@@ -5214,18 +5328,18 @@
           <wp:inline>
             <wp:extent cx="5334000" cy="3333750"/>
             <wp:effectExtent b="0" l="0" r="0" t="0"/>
-            <wp:docPr descr="Figure 11. DIVA APK uploaded through the MobSF web interface; the static analysis is running." title="" id="66" name="Picture"/>
+            <wp:docPr descr="Figure 11. DIVA APK uploaded through the MobSF web interface; the static analysis is running." title="" id="67" name="Picture"/>
             <a:graphic>
               <a:graphicData uri="http://schemas.openxmlformats.org/drawingml/2006/picture">
                 <pic:pic>
                   <pic:nvPicPr>
-                    <pic:cNvPr descr="../Screenshots/09_stage3_apk_upload_analysis_running.png" id="67" name="Picture"/>
+                    <pic:cNvPr descr="../Screenshots/09_stage3_apk_upload_analysis_running.png" id="68" name="Picture"/>
                     <pic:cNvPicPr>
                       <a:picLocks noChangeArrowheads="1" noChangeAspect="1"/>
                     </pic:cNvPicPr>
                   </pic:nvPicPr>
                   <pic:blipFill>
-                    <a:blip r:embed="rId65"/>
+                    <a:blip r:embed="rId66"/>
                     <a:stretch>
                       <a:fillRect/>
                     </a:stretch>
@@ -5269,18 +5383,18 @@
           <wp:inline>
             <wp:extent cx="5334000" cy="5150729"/>
             <wp:effectExtent b="0" l="0" r="0" t="0"/>
-            <wp:docPr descr="Figure 12. MobSF analysis log for the scan. It shows each automated step, including successful JADX decompilation and SAST." title="" id="69" name="Picture"/>
+            <wp:docPr descr="Figure 12. MobSF analysis log for the scan. It shows each automated step, including successful JADX decompilation and SAST." title="" id="70" name="Picture"/>
             <a:graphic>
               <a:graphicData uri="http://schemas.openxmlformats.org/drawingml/2006/picture">
                 <pic:pic>
                   <pic:nvPicPr>
-                    <pic:cNvPr descr="../Screenshots/10_stage3_mobsf_scan_log.png" id="70" name="Picture"/>
+                    <pic:cNvPr descr="../Screenshots/10_stage3_mobsf_scan_log.png" id="71" name="Picture"/>
                     <pic:cNvPicPr>
                       <a:picLocks noChangeArrowheads="1" noChangeAspect="1"/>
                     </pic:cNvPicPr>
                   </pic:nvPicPr>
                   <pic:blipFill>
-                    <a:blip r:embed="rId68"/>
+                    <a:blip r:embed="rId69"/>
                     <a:stretch>
                       <a:fillRect/>
                     </a:stretch>
@@ -5324,18 +5438,18 @@
           <wp:inline>
             <wp:extent cx="5334000" cy="3333750"/>
             <wp:effectExtent b="0" l="0" r="0" t="0"/>
-            <wp:docPr descr="Figure 13. MobSF result page for the student-built DIVA APK. It shows the security score of 47/100, file hashes, application information (Diva, jakhar.aseem.diva, Target SDK 23, Min SDK 15), 2/17 exported activities, 1/1 exported provider and the signer certificate." title="" id="72" name="Picture"/>
+            <wp:docPr descr="Figure 13. MobSF result page for the student-built DIVA APK. It shows the security score of 47/100, file hashes, application information (Diva, jakhar.aseem.diva, Target SDK 23, Min SDK 15), 2/17 exported activities, 1/1 exported provider and the signer certificate." title="" id="73" name="Picture"/>
             <a:graphic>
               <a:graphicData uri="http://schemas.openxmlformats.org/drawingml/2006/picture">
                 <pic:pic>
                   <pic:nvPicPr>
-                    <pic:cNvPr descr="../Screenshots/11_stage3_result_page_overview.png" id="73" name="Picture"/>
+                    <pic:cNvPr descr="../Screenshots/11_stage3_result_page_overview.png" id="74" name="Picture"/>
                     <pic:cNvPicPr>
                       <a:picLocks noChangeArrowheads="1" noChangeAspect="1"/>
                     </pic:cNvPicPr>
                   </pic:nvPicPr>
                   <pic:blipFill>
-                    <a:blip r:embed="rId71"/>
+                    <a:blip r:embed="rId72"/>
                     <a:stretch>
                       <a:fillRect/>
                     </a:stretch>
@@ -5379,18 +5493,18 @@
           <wp:inline>
             <wp:extent cx="5334000" cy="4179873"/>
             <wp:effectExtent b="0" l="0" r="0" t="0"/>
-            <wp:docPr descr="Figure 14. MobSF Application Security Scorecard: score 47, Grade B, “Medium Risk”, and High 2 / Medium 8 / Info 1 / Secure 1 / Hotspot 1, with each finding and its source section." title="" id="75" name="Picture"/>
+            <wp:docPr descr="Figure 14. MobSF Application Security Scorecard: score 47, Grade B, “Medium Risk”, and High 2 / Medium 8 / Info 1 / Secure 1 / Hotspot 1, with each finding and its source section." title="" id="76" name="Picture"/>
             <a:graphic>
               <a:graphicData uri="http://schemas.openxmlformats.org/drawingml/2006/picture">
                 <pic:pic>
                   <pic:nvPicPr>
-                    <pic:cNvPr descr="../Screenshots/12_stage3_appsec_scorecard.png" id="76" name="Picture"/>
+                    <pic:cNvPr descr="../Screenshots/12_stage3_appsec_scorecard.png" id="77" name="Picture"/>
                     <pic:cNvPicPr>
                       <a:picLocks noChangeArrowheads="1" noChangeAspect="1"/>
                     </pic:cNvPicPr>
                   </pic:nvPicPr>
                   <pic:blipFill>
-                    <a:blip r:embed="rId74"/>
+                    <a:blip r:embed="rId75"/>
                     <a:stretch>
                       <a:fillRect/>
                     </a:stretch>
@@ -5449,18 +5563,18 @@
           <wp:inline>
             <wp:extent cx="5334000" cy="4074583"/>
             <wp:effectExtent b="0" l="0" r="0" t="0"/>
-            <wp:docPr descr="Figure 15. Certificate analysis: the APK is signed with a debug certificate (high) and has a v1 signature, so MobSF flags Janus (warning)." title="" id="78" name="Picture"/>
+            <wp:docPr descr="Figure 15. Certificate analysis: the APK is signed with a debug certificate (high) and has a v1 signature, so MobSF flags Janus (warning)." title="" id="79" name="Picture"/>
             <a:graphic>
               <a:graphicData uri="http://schemas.openxmlformats.org/drawingml/2006/picture">
                 <pic:pic>
                   <pic:nvPicPr>
-                    <pic:cNvPr descr="../Screenshots/14_stage3_certificate_analysis.png" id="79" name="Picture"/>
+                    <pic:cNvPr descr="../Screenshots/14_stage3_certificate_analysis.png" id="80" name="Picture"/>
                     <pic:cNvPicPr>
                       <a:picLocks noChangeArrowheads="1" noChangeAspect="1"/>
                     </pic:cNvPicPr>
                   </pic:nvPicPr>
                   <pic:blipFill>
-                    <a:blip r:embed="rId77"/>
+                    <a:blip r:embed="rId78"/>
                     <a:stretch>
                       <a:fillRect/>
                     </a:stretch>
@@ -5504,18 +5618,18 @@
           <wp:inline>
             <wp:extent cx="5334000" cy="4074583"/>
             <wp:effectExtent b="0" l="0" r="0" t="0"/>
-            <wp:docPr descr="Figure 16. Permissions: WRITE_EXTERNAL_STORAGE and READ_EXTERNAL_STORAGE (dangerous) and INTERNET (normal)." title="" id="81" name="Picture"/>
+            <wp:docPr descr="Figure 16. Permissions: WRITE_EXTERNAL_STORAGE and READ_EXTERNAL_STORAGE (dangerous) and INTERNET (normal)." title="" id="82" name="Picture"/>
             <a:graphic>
               <a:graphicData uri="http://schemas.openxmlformats.org/drawingml/2006/picture">
                 <pic:pic>
                   <pic:nvPicPr>
-                    <pic:cNvPr descr="../Screenshots/15_stage3_permissions.png" id="82" name="Picture"/>
+                    <pic:cNvPr descr="../Screenshots/15_stage3_permissions.png" id="83" name="Picture"/>
                     <pic:cNvPicPr>
                       <a:picLocks noChangeArrowheads="1" noChangeAspect="1"/>
                     </pic:cNvPicPr>
                   </pic:nvPicPr>
                   <pic:blipFill>
-                    <a:blip r:embed="rId80"/>
+                    <a:blip r:embed="rId81"/>
                     <a:stretch>
                       <a:fillRect/>
                     </a:stretch>
@@ -5559,18 +5673,18 @@
           <wp:inline>
             <wp:extent cx="5334000" cy="4074583"/>
             <wp:effectExtent b="0" l="0" r="0" t="0"/>
-            <wp:docPr descr="Figure 17. Manifest analysis: minSdk 15 (high); allowBackup=true; exported .APICredsActivity and .APICreds2Activity with intent filters; exported, unprotected .NotesProvider (warning)." title="" id="84" name="Picture"/>
+            <wp:docPr descr="Figure 17. Manifest analysis: minSdk 15 (high); allowBackup=true; exported .APICredsActivity and .APICreds2Activity with intent filters; exported, unprotected .NotesProvider (warning)." title="" id="85" name="Picture"/>
             <a:graphic>
               <a:graphicData uri="http://schemas.openxmlformats.org/drawingml/2006/picture">
                 <pic:pic>
                   <pic:nvPicPr>
-                    <pic:cNvPr descr="../Screenshots/16_stage3_manifest_analysis.png" id="85" name="Picture"/>
+                    <pic:cNvPr descr="../Screenshots/16_stage3_manifest_analysis.png" id="86" name="Picture"/>
                     <pic:cNvPicPr>
                       <a:picLocks noChangeArrowheads="1" noChangeAspect="1"/>
                     </pic:cNvPicPr>
                   </pic:nvPicPr>
                   <pic:blipFill>
-                    <a:blip r:embed="rId83"/>
+                    <a:blip r:embed="rId84"/>
                     <a:stretch>
                       <a:fillRect/>
                     </a:stretch>
@@ -5659,18 +5773,18 @@
           <wp:inline>
             <wp:extent cx="5334000" cy="4074583"/>
             <wp:effectExtent b="0" l="0" r="0" t="0"/>
-            <wp:docPr descr="Figure 18. Code analysis (SAST): logging of sensitive information (CWE-532), raw SQL queries (CWE-89), temp-file creation and external-storage read/write (CWE-276), with the affected DIVA classes." title="" id="87" name="Picture"/>
+            <wp:docPr descr="Figure 18. Code analysis (SAST): logging of sensitive information (CWE-532), raw SQL queries (CWE-89), temp-file creation and external-storage read/write (CWE-276), with the affected DIVA classes." title="" id="88" name="Picture"/>
             <a:graphic>
               <a:graphicData uri="http://schemas.openxmlformats.org/drawingml/2006/picture">
                 <pic:pic>
                   <pic:nvPicPr>
-                    <pic:cNvPr descr="../Screenshots/17_stage3_code_analysis.png" id="88" name="Picture"/>
+                    <pic:cNvPr descr="../Screenshots/17_stage3_code_analysis.png" id="89" name="Picture"/>
                     <pic:cNvPicPr>
                       <a:picLocks noChangeArrowheads="1" noChangeAspect="1"/>
                     </pic:cNvPicPr>
                   </pic:nvPicPr>
                   <pic:blipFill>
-                    <a:blip r:embed="rId86"/>
+                    <a:blip r:embed="rId87"/>
                     <a:stretch>
                       <a:fillRect/>
                     </a:stretch>
@@ -5714,18 +5828,18 @@
           <wp:inline>
             <wp:extent cx="5334000" cy="4074583"/>
             <wp:effectExtent b="0" l="0" r="0" t="0"/>
-            <wp:docPr descr="Figure 19. Shared-library binary analysis of libdivajni.so: NX, PIC and Full RELRO are present, but there is no stack canary (high), because Android.mk builds with -fno-stack-protector. FORTIFY replaced strcpy with __strcpy_chk." title="" id="90" name="Picture"/>
+            <wp:docPr descr="Figure 19. Shared-library binary analysis of libdivajni.so: NX, PIC and Full RELRO are present, but there is no stack canary (high), because Android.mk builds with -fno-stack-protector. FORTIFY replaced strcpy with __strcpy_chk." title="" id="91" name="Picture"/>
             <a:graphic>
               <a:graphicData uri="http://schemas.openxmlformats.org/drawingml/2006/picture">
                 <pic:pic>
                   <pic:nvPicPr>
-                    <pic:cNvPr descr="../Screenshots/18_stage3_shared_library_binary_analysis.png" id="91" name="Picture"/>
+                    <pic:cNvPr descr="../Screenshots/18_stage3_shared_library_binary_analysis.png" id="92" name="Picture"/>
                     <pic:cNvPicPr>
                       <a:picLocks noChangeArrowheads="1" noChangeAspect="1"/>
                     </pic:cNvPicPr>
                   </pic:nvPicPr>
                   <pic:blipFill>
-                    <a:blip r:embed="rId89"/>
+                    <a:blip r:embed="rId90"/>
                     <a:stretch>
                       <a:fillRect/>
                     </a:stretch>
@@ -5833,18 +5947,18 @@
           <wp:inline>
             <wp:extent cx="5334000" cy="4074583"/>
             <wp:effectExtent b="0" l="0" r="0" t="0"/>
-            <wp:docPr descr="Figure 20. Possible hardcoded secrets (&quot;pkey&quot; : &quot;notespin&quot;) and strings extracted from the native libraries, including the native vendor key olsdfgad;lh and the code .dotdot." title="" id="93" name="Picture"/>
+            <wp:docPr descr="Figure 20. Possible hardcoded secrets (&quot;pkey&quot; : &quot;notespin&quot;) and strings extracted from the native libraries, including the native vendor key olsdfgad;lh and the code .dotdot." title="" id="94" name="Picture"/>
             <a:graphic>
               <a:graphicData uri="http://schemas.openxmlformats.org/drawingml/2006/picture">
                 <pic:pic>
                   <pic:nvPicPr>
-                    <pic:cNvPr descr="../Screenshots/20_stage3_secrets_and_strings.png" id="94" name="Picture"/>
+                    <pic:cNvPr descr="../Screenshots/20_stage3_secrets_and_strings.png" id="95" name="Picture"/>
                     <pic:cNvPicPr>
                       <a:picLocks noChangeArrowheads="1" noChangeAspect="1"/>
                     </pic:cNvPicPr>
                   </pic:nvPicPr>
                   <pic:blipFill>
-                    <a:blip r:embed="rId92"/>
+                    <a:blip r:embed="rId93"/>
                     <a:stretch>
                       <a:fillRect/>
                     </a:stretch>
@@ -5915,8 +6029,8 @@
         <w:t xml:space="preserve">.</w:t>
       </w:r>
     </w:p>
-    <w:bookmarkEnd w:id="95"/>
-    <w:bookmarkStart w:id="96" w:name="assessment-results"/>
+    <w:bookmarkEnd w:id="96"/>
+    <w:bookmarkStart w:id="97" w:name="assessment-results"/>
     <w:p>
       <w:pPr>
         <w:pStyle w:val="Heading1"/>
@@ -7494,8 +7608,8 @@
         <w:t xml:space="preserve">without stack canary (High, binary analysis); 2 dangerous storage permissions (Hotspot).</w:t>
       </w:r>
     </w:p>
-    <w:bookmarkEnd w:id="96"/>
-    <w:bookmarkStart w:id="103" w:name="X85f533ad0c7c4a5293a6bbc73eb019b98990749"/>
+    <w:bookmarkEnd w:id="97"/>
+    <w:bookmarkStart w:id="104" w:name="X85f533ad0c7c4a5293a6bbc73eb019b98990749"/>
     <w:p>
       <w:pPr>
         <w:pStyle w:val="Heading1"/>
@@ -7522,7 +7636,7 @@
         <w:t xml:space="preserve">Priority combines (a) the MobSF severity, (b) the potential impact on the CIA properties and authorization, and (c) likelihood/exposure: who can trigger the flaw, whether a permission or user interaction is needed, and whether any app on the device can reach it. MobSF’s severities are recorded unchanged. Where my remediation priority differs from MobSF’s rating, the reason is given.</w:t>
       </w:r>
     </w:p>
-    <w:bookmarkStart w:id="97" w:name="Xb0c824476a6563b08fd8dde531ff39fa389c8b8"/>
+    <w:bookmarkStart w:id="98" w:name="Xb0c824476a6563b08fd8dde531ff39fa389c8b8"/>
     <w:p>
       <w:pPr>
         <w:pStyle w:val="Heading2"/>
@@ -7915,8 +8029,8 @@
         <w:t xml:space="preserve">exposure is maximal, because any co-installed app can exploit it silently, with no user interaction and no permission. The fix is trivial, so the risk-reduction-to-effort ratio is the best of all findings.</w:t>
       </w:r>
     </w:p>
-    <w:bookmarkEnd w:id="97"/>
-    <w:bookmarkStart w:id="98" w:name="X37cb8a103830b8d52e4e245ea1ee9bbe7f4d71d"/>
+    <w:bookmarkEnd w:id="98"/>
+    <w:bookmarkStart w:id="99" w:name="X37cb8a103830b8d52e4e245ea1ee9bbe7f4d71d"/>
     <w:p>
       <w:pPr>
         <w:pStyle w:val="Heading2"/>
@@ -8185,8 +8299,8 @@
         <w:t xml:space="preserve">the flaw is directly exploitable and needs no special tools. It leads to full disclosure of the most sensitive data in the app.</w:t>
       </w:r>
     </w:p>
-    <w:bookmarkEnd w:id="98"/>
-    <w:bookmarkStart w:id="99" w:name="X8a3707083b225c75aebef1c67b2a9c44dbc34e8"/>
+    <w:bookmarkEnd w:id="99"/>
+    <w:bookmarkStart w:id="100" w:name="X8a3707083b225c75aebef1c67b2a9c44dbc34e8"/>
     <w:p>
       <w:pPr>
         <w:pStyle w:val="Heading2"/>
@@ -8454,8 +8568,8 @@
         <w:t xml:space="preserve">the data is credentials, the storage location is world-readable by design, and exploiting it needs only a common permission.</w:t>
       </w:r>
     </w:p>
-    <w:bookmarkEnd w:id="99"/>
-    <w:bookmarkStart w:id="100" w:name="X534da6f493de03274bee4aa29c45db5ca5adf06"/>
+    <w:bookmarkEnd w:id="100"/>
+    <w:bookmarkStart w:id="101" w:name="X534da6f493de03274bee4aa29c45db5ca5adf06"/>
     <w:p>
       <w:pPr>
         <w:pStyle w:val="Heading2"/>
@@ -8729,8 +8843,8 @@
         <w:t xml:space="preserve">the impact is credential disclosure, but exposure is lower than in Finding 1. The data appears on screen rather than being returned to the calling app, so harvesting it needs adb/screen access or a second weakness. The root problem, hardcoded API credentials in the client, also needs fixing.</w:t>
       </w:r>
     </w:p>
-    <w:bookmarkEnd w:id="100"/>
-    <w:bookmarkStart w:id="101" w:name="Xf70b83b82999fd251f8e2996477c551ed4406ad"/>
+    <w:bookmarkEnd w:id="101"/>
+    <w:bookmarkStart w:id="102" w:name="Xf70b83b82999fd251f8e2996477c551ed4406ad"/>
     <w:p>
       <w:pPr>
         <w:pStyle w:val="Heading2"/>
@@ -8962,8 +9076,8 @@
         <w:t xml:space="preserve">reading the log needs adb, a bug report or a legacy device, so exposure is lower than for Findings 1–3. The data is still highly sensitive, and the fix is trivial.</w:t>
       </w:r>
     </w:p>
-    <w:bookmarkEnd w:id="101"/>
-    <w:bookmarkStart w:id="102" w:name="X591550b399aef875c08c71b4484baf2a68ad26f"/>
+    <w:bookmarkEnd w:id="102"/>
+    <w:bookmarkStart w:id="103" w:name="X591550b399aef875c08c71b4484baf2a68ad26f"/>
     <w:p>
       <w:pPr>
         <w:pStyle w:val="Heading2"/>
@@ -9466,9 +9580,9 @@
         <w:t xml:space="preserve">, and Frida/drozer. These steps were out of scope for this static lab.</w:t>
       </w:r>
     </w:p>
-    <w:bookmarkEnd w:id="102"/>
     <w:bookmarkEnd w:id="103"/>
-    <w:bookmarkStart w:id="104" w:name="remediation-recommendations-stage-5"/>
+    <w:bookmarkEnd w:id="104"/>
+    <w:bookmarkStart w:id="105" w:name="remediation-recommendations-stage-5"/>
     <w:p>
       <w:pPr>
         <w:pStyle w:val="Heading1"/>
@@ -10647,8 +10761,8 @@
         <w:t xml:space="preserve">is a one-line change that removes the whole attack surface at once.</w:t>
       </w:r>
     </w:p>
-    <w:bookmarkEnd w:id="104"/>
-    <w:bookmarkStart w:id="105" w:name="limitations-and-validation"/>
+    <w:bookmarkEnd w:id="105"/>
+    <w:bookmarkStart w:id="106" w:name="limitations-and-validation"/>
     <w:p>
       <w:pPr>
         <w:pStyle w:val="Heading1"/>
@@ -10941,8 +11055,8 @@
         <w:t xml:space="preserve">, drozer, and Frida. Then retest after the remediation is in place.</w:t>
       </w:r>
     </w:p>
-    <w:bookmarkEnd w:id="105"/>
-    <w:bookmarkStart w:id="106" w:name="conclusion"/>
+    <w:bookmarkEnd w:id="106"/>
+    <w:bookmarkStart w:id="107" w:name="conclusion"/>
     <w:p>
       <w:pPr>
         <w:pStyle w:val="Heading1"/>
@@ -11011,8 +11125,8 @@
         <w:t xml:space="preserve">private, is also the cheapest. Automated assessment is an efficient first line of defence, but it must be combined with manual review and dynamic validation before conclusions are final.</w:t>
       </w:r>
     </w:p>
-    <w:bookmarkEnd w:id="106"/>
-    <w:bookmarkStart w:id="110" w:name="references"/>
+    <w:bookmarkEnd w:id="107"/>
+    <w:bookmarkStart w:id="111" w:name="references"/>
     <w:p>
       <w:pPr>
         <w:pStyle w:val="Heading1"/>
@@ -11372,7 +11486,7 @@
       <w:r>
         <w:t xml:space="preserve"> </w:t>
       </w:r>
-      <w:hyperlink r:id="rId107">
+      <w:hyperlink r:id="rId108">
         <w:r>
           <w:rPr>
             <w:rStyle w:val="Hyperlink"/>
@@ -11408,7 +11522,7 @@
       <w:r>
         <w:t xml:space="preserve"> </w:t>
       </w:r>
-      <w:hyperlink r:id="rId108">
+      <w:hyperlink r:id="rId109">
         <w:r>
           <w:rPr>
             <w:rStyle w:val="Hyperlink"/>
@@ -11444,7 +11558,7 @@
       <w:r>
         <w:t xml:space="preserve"> </w:t>
       </w:r>
-      <w:hyperlink r:id="rId109">
+      <w:hyperlink r:id="rId110">
         <w:r>
           <w:rPr>
             <w:rStyle w:val="Hyperlink"/>
@@ -11453,8 +11567,8 @@
         </w:r>
       </w:hyperlink>
     </w:p>
-    <w:bookmarkEnd w:id="110"/>
-    <w:bookmarkStart w:id="138" w:name="appendix-a-screenshots-and-evidence"/>
+    <w:bookmarkEnd w:id="111"/>
+    <w:bookmarkStart w:id="139" w:name="appendix-a-screenshots-and-evidence"/>
     <w:p>
       <w:pPr>
         <w:pStyle w:val="Heading1"/>
@@ -11472,18 +11586,18 @@
           <wp:inline>
             <wp:extent cx="5334000" cy="4074583"/>
             <wp:effectExtent b="0" l="0" r="0" t="0"/>
-            <wp:docPr descr="Figure 21. Application information section of the MobSF report." title="" id="112" name="Picture"/>
+            <wp:docPr descr="Figure 21. Application information section of the MobSF report." title="" id="113" name="Picture"/>
             <a:graphic>
               <a:graphicData uri="http://schemas.openxmlformats.org/drawingml/2006/picture">
                 <pic:pic>
                   <pic:nvPicPr>
-                    <pic:cNvPr descr="../Screenshots/13_stage3_app_information.png" id="113" name="Picture"/>
+                    <pic:cNvPr descr="../Screenshots/13_stage3_app_information.png" id="114" name="Picture"/>
                     <pic:cNvPicPr>
                       <a:picLocks noChangeArrowheads="1" noChangeAspect="1"/>
                     </pic:cNvPicPr>
                   </pic:nvPicPr>
                   <pic:blipFill>
-                    <a:blip r:embed="rId111"/>
+                    <a:blip r:embed="rId112"/>
                     <a:stretch>
                       <a:fillRect/>
                     </a:stretch>
@@ -11527,18 +11641,18 @@
           <wp:inline>
             <wp:extent cx="5334000" cy="3259666"/>
             <wp:effectExtent b="0" l="0" r="0" t="0"/>
-            <wp:docPr descr="Figure 22. Decoded AndroidManifest.xml as shown by MobSF (evidence for Findings 1 and 4: provider at line 37, exported activities at lines 24–36, allowBackup=&quot;true&quot; at line 8)." title="" id="115" name="Picture"/>
+            <wp:docPr descr="Figure 22. Decoded AndroidManifest.xml as shown by MobSF (evidence for Findings 1 and 4: provider at line 37, exported activities at lines 24–36, allowBackup=&quot;true&quot; at line 8)." title="" id="116" name="Picture"/>
             <a:graphic>
               <a:graphicData uri="http://schemas.openxmlformats.org/drawingml/2006/picture">
                 <pic:pic>
                   <pic:nvPicPr>
-                    <pic:cNvPr descr="../Screenshots/22_stage4_manifest_xml_evidence.png" id="116" name="Picture"/>
+                    <pic:cNvPr descr="../Screenshots/22_stage4_manifest_xml_evidence.png" id="117" name="Picture"/>
                     <pic:cNvPicPr>
                       <a:picLocks noChangeArrowheads="1" noChangeAspect="1"/>
                     </pic:cNvPicPr>
                   </pic:nvPicPr>
                   <pic:blipFill>
-                    <a:blip r:embed="rId114"/>
+                    <a:blip r:embed="rId115"/>
                     <a:stretch>
                       <a:fillRect/>
                     </a:stretch>
@@ -11597,18 +11711,18 @@
           <wp:inline>
             <wp:extent cx="5334000" cy="3259666"/>
             <wp:effectExtent b="0" l="0" r="0" t="0"/>
-            <wp:docPr descr="Figure 23. MobSF source view of SQLInjectionActivity.java: plaintext credentials and card numbers (lines 23–26) and string-concatenated rawQuery (line 36) – Finding 2." title="" id="118" name="Picture"/>
+            <wp:docPr descr="Figure 23. MobSF source view of SQLInjectionActivity.java: plaintext credentials and card numbers (lines 23–26) and string-concatenated rawQuery (line 36) – Finding 2." title="" id="119" name="Picture"/>
             <a:graphic>
               <a:graphicData uri="http://schemas.openxmlformats.org/drawingml/2006/picture">
                 <pic:pic>
                   <pic:nvPicPr>
-                    <pic:cNvPr descr="../Screenshots/23_stage4_SQLInjectionActivity_source.png" id="119" name="Picture"/>
+                    <pic:cNvPr descr="../Screenshots/23_stage4_SQLInjectionActivity_source.png" id="120" name="Picture"/>
                     <pic:cNvPicPr>
                       <a:picLocks noChangeArrowheads="1" noChangeAspect="1"/>
                     </pic:cNvPicPr>
                   </pic:nvPicPr>
                   <pic:blipFill>
-                    <a:blip r:embed="rId117"/>
+                    <a:blip r:embed="rId118"/>
                     <a:stretch>
                       <a:fillRect/>
                     </a:stretch>
@@ -11679,18 +11793,18 @@
           <wp:inline>
             <wp:extent cx="5334000" cy="6249077"/>
             <wp:effectExtent b="0" l="0" r="0" t="0"/>
-            <wp:docPr descr="Figure 24. MobSF source view of NotesProvider.java: unrestricted query/insert/update/delete on private notes and SQL built from URI segments – Finding 1." title="" id="121" name="Picture"/>
+            <wp:docPr descr="Figure 24. MobSF source view of NotesProvider.java: unrestricted query/insert/update/delete on private notes and SQL built from URI segments – Finding 1." title="" id="122" name="Picture"/>
             <a:graphic>
               <a:graphicData uri="http://schemas.openxmlformats.org/drawingml/2006/picture">
                 <pic:pic>
                   <pic:nvPicPr>
-                    <pic:cNvPr descr="../Screenshots/24_stage4_NotesProvider_source.png" id="122" name="Picture"/>
+                    <pic:cNvPr descr="../Screenshots/24_stage4_NotesProvider_source.png" id="123" name="Picture"/>
                     <pic:cNvPicPr>
                       <a:picLocks noChangeArrowheads="1" noChangeAspect="1"/>
                     </pic:cNvPicPr>
                   </pic:nvPicPr>
                   <pic:blipFill>
-                    <a:blip r:embed="rId120"/>
+                    <a:blip r:embed="rId121"/>
                     <a:stretch>
                       <a:fillRect/>
                     </a:stretch>
@@ -11746,18 +11860,18 @@
           <wp:inline>
             <wp:extent cx="5334000" cy="3259666"/>
             <wp:effectExtent b="0" l="0" r="0" t="0"/>
-            <wp:docPr descr="Figure 25. MobSF source view of InsecureDataStorage4Activity.java: credentials written to /sdcard/.uinfo.txt – Finding 3." title="" id="124" name="Picture"/>
+            <wp:docPr descr="Figure 25. MobSF source view of InsecureDataStorage4Activity.java: credentials written to /sdcard/.uinfo.txt – Finding 3." title="" id="125" name="Picture"/>
             <a:graphic>
               <a:graphicData uri="http://schemas.openxmlformats.org/drawingml/2006/picture">
                 <pic:pic>
                   <pic:nvPicPr>
-                    <pic:cNvPr descr="../Screenshots/25_stage4_InsecureDataStorage4_source.png" id="125" name="Picture"/>
+                    <pic:cNvPr descr="../Screenshots/25_stage4_InsecureDataStorage4_source.png" id="126" name="Picture"/>
                     <pic:cNvPicPr>
                       <a:picLocks noChangeArrowheads="1" noChangeAspect="1"/>
                     </pic:cNvPicPr>
                   </pic:nvPicPr>
                   <pic:blipFill>
-                    <a:blip r:embed="rId123"/>
+                    <a:blip r:embed="rId124"/>
                     <a:stretch>
                       <a:fillRect/>
                     </a:stretch>
@@ -11828,18 +11942,18 @@
           <wp:inline>
             <wp:extent cx="5334000" cy="3259666"/>
             <wp:effectExtent b="0" l="0" r="0" t="0"/>
-            <wp:docPr descr="Figure 26. MobSF source view of LogActivity.java: credit card number written to logcat with Log.e – Finding 5." title="" id="127" name="Picture"/>
+            <wp:docPr descr="Figure 26. MobSF source view of LogActivity.java: credit card number written to logcat with Log.e – Finding 5." title="" id="128" name="Picture"/>
             <a:graphic>
               <a:graphicData uri="http://schemas.openxmlformats.org/drawingml/2006/picture">
                 <pic:pic>
                   <pic:nvPicPr>
-                    <pic:cNvPr descr="../Screenshots/26_stage4_LogActivity_source.png" id="128" name="Picture"/>
+                    <pic:cNvPr descr="../Screenshots/26_stage4_LogActivity_source.png" id="129" name="Picture"/>
                     <pic:cNvPicPr>
                       <a:picLocks noChangeArrowheads="1" noChangeAspect="1"/>
                     </pic:cNvPicPr>
                   </pic:nvPicPr>
                   <pic:blipFill>
-                    <a:blip r:embed="rId126"/>
+                    <a:blip r:embed="rId127"/>
                     <a:stretch>
                       <a:fillRect/>
                     </a:stretch>
@@ -11910,18 +12024,18 @@
           <wp:inline>
             <wp:extent cx="5334000" cy="3259666"/>
             <wp:effectExtent b="0" l="0" r="0" t="0"/>
-            <wp:docPr descr="Figure 27. MobSF source view of HardcodeActivity.java: hardcoded key vendorsecretkey, which MobSF did not flag as a secret (false negative, Section 10.6)." title="" id="130" name="Picture"/>
+            <wp:docPr descr="Figure 27. MobSF source view of HardcodeActivity.java: hardcoded key vendorsecretkey, which MobSF did not flag as a secret (false negative, Section 10.6)." title="" id="131" name="Picture"/>
             <a:graphic>
               <a:graphicData uri="http://schemas.openxmlformats.org/drawingml/2006/picture">
                 <pic:pic>
                   <pic:nvPicPr>
-                    <pic:cNvPr descr="../Screenshots/27_stage4_HardcodeActivity_source_false_negative.png" id="131" name="Picture"/>
+                    <pic:cNvPr descr="../Screenshots/27_stage4_HardcodeActivity_source_false_negative.png" id="132" name="Picture"/>
                     <pic:cNvPicPr>
                       <a:picLocks noChangeArrowheads="1" noChangeAspect="1"/>
                     </pic:cNvPicPr>
                   </pic:nvPicPr>
                   <pic:blipFill>
-                    <a:blip r:embed="rId129"/>
+                    <a:blip r:embed="rId130"/>
                     <a:stretch>
                       <a:fillRect/>
                     </a:stretch>
@@ -11989,18 +12103,18 @@
           <wp:inline>
             <wp:extent cx="5334000" cy="4074583"/>
             <wp:effectExtent b="0" l="0" r="0" t="0"/>
-            <wp:docPr descr="Figure 28. Android API usage detected by MobSF (IPC, local file I/O, native code, content provider, start activity)." title="" id="133" name="Picture"/>
+            <wp:docPr descr="Figure 28. Android API usage detected by MobSF (IPC, local file I/O, native code, content provider, start activity)." title="" id="134" name="Picture"/>
             <a:graphic>
               <a:graphicData uri="http://schemas.openxmlformats.org/drawingml/2006/picture">
                 <pic:pic>
                   <pic:nvPicPr>
-                    <pic:cNvPr descr="../Screenshots/19_stage3_android_api.png" id="134" name="Picture"/>
+                    <pic:cNvPr descr="../Screenshots/19_stage3_android_api.png" id="135" name="Picture"/>
                     <pic:cNvPicPr>
                       <a:picLocks noChangeArrowheads="1" noChangeAspect="1"/>
                     </pic:cNvPicPr>
                   </pic:nvPicPr>
                   <pic:blipFill>
-                    <a:blip r:embed="rId132"/>
+                    <a:blip r:embed="rId133"/>
                     <a:stretch>
                       <a:fillRect/>
                     </a:stretch>
@@ -12044,18 +12158,18 @@
           <wp:inline>
             <wp:extent cx="5334000" cy="4074583"/>
             <wp:effectExtent b="0" l="0" r="0" t="0"/>
-            <wp:docPr descr="Figure 29. Components section of the MobSF report (activities and providers)." title="" id="136" name="Picture"/>
+            <wp:docPr descr="Figure 29. Components section of the MobSF report (activities and providers)." title="" id="137" name="Picture"/>
             <a:graphic>
               <a:graphicData uri="http://schemas.openxmlformats.org/drawingml/2006/picture">
                 <pic:pic>
                   <pic:nvPicPr>
-                    <pic:cNvPr descr="../Screenshots/21_stage3_components.png" id="137" name="Picture"/>
+                    <pic:cNvPr descr="../Screenshots/21_stage3_components.png" id="138" name="Picture"/>
                     <pic:cNvPicPr>
                       <a:picLocks noChangeArrowheads="1" noChangeAspect="1"/>
                     </pic:cNvPicPr>
                   </pic:nvPicPr>
                   <pic:blipFill>
-                    <a:blip r:embed="rId135"/>
+                    <a:blip r:embed="rId136"/>
                     <a:stretch>
                       <a:fillRect/>
                     </a:stretch>
@@ -12099,124 +12213,16 @@
           <w:bCs/>
           <w:b/>
         </w:rPr>
-        <w:t xml:space="preserve">Supporting files in the submission package:</w:t>
-      </w:r>
-      <w:r>
-        <w:t xml:space="preserve"> </w:t>
-      </w:r>
-      <w:r>
-        <w:rPr>
-          <w:rStyle w:val="VerbatimChar"/>
-        </w:rPr>
-        <w:t xml:space="preserve">MobSF_Reports/MobSF_DIVA_report.pdf</w:t>
-      </w:r>
-      <w:r>
-        <w:t xml:space="preserve"> </w:t>
-      </w:r>
-      <w:r>
-        <w:t xml:space="preserve">(MobSF’s own 25-page export),</w:t>
-      </w:r>
-      <w:r>
-        <w:t xml:space="preserve"> </w:t>
-      </w:r>
-      <w:r>
-        <w:rPr>
-          <w:rStyle w:val="VerbatimChar"/>
-        </w:rPr>
-        <w:t xml:space="preserve">MobSF_DIVA_report.json</w:t>
-      </w:r>
-      <w:r>
-        <w:t xml:space="preserve"> </w:t>
-      </w:r>
-      <w:r>
-        <w:t xml:space="preserve">and</w:t>
-      </w:r>
-      <w:r>
-        <w:t xml:space="preserve"> </w:t>
-      </w:r>
-      <w:r>
-        <w:rPr>
-          <w:rStyle w:val="VerbatimChar"/>
-        </w:rPr>
-        <w:t xml:space="preserve">MobSF_DIVA_scorecard.json</w:t>
-      </w:r>
-      <w:r>
-        <w:t xml:space="preserve">;</w:t>
-      </w:r>
-      <w:r>
-        <w:t xml:space="preserve"> </w:t>
-      </w:r>
-      <w:r>
-        <w:rPr>
-          <w:rStyle w:val="VerbatimChar"/>
-        </w:rPr>
-        <w:t xml:space="preserve">APK/diva-app-debug.apk</w:t>
-      </w:r>
-      <w:r>
-        <w:t xml:space="preserve"> </w:t>
-      </w:r>
-      <w:r>
-        <w:t xml:space="preserve">with its SHA-256;</w:t>
-      </w:r>
-      <w:r>
-        <w:t xml:space="preserve"> </w:t>
-      </w:r>
-      <w:r>
-        <w:rPr>
-          <w:rStyle w:val="VerbatimChar"/>
-        </w:rPr>
-        <w:t xml:space="preserve">Build/</w:t>
-      </w:r>
-      <w:r>
-        <w:t xml:space="preserve"> </w:t>
-      </w:r>
-      <w:r>
-        <w:t xml:space="preserve">(build script, logs, Android Studio modernization patch, evidence capture scripts);</w:t>
-      </w:r>
-      <w:r>
-        <w:t xml:space="preserve"> </w:t>
-      </w:r>
-      <w:r>
-        <w:rPr>
-          <w:rStyle w:val="VerbatimChar"/>
-        </w:rPr>
-        <w:t xml:space="preserve">Screenshots/</w:t>
-      </w:r>
-      <w:r>
-        <w:t xml:space="preserve"> </w:t>
-      </w:r>
-      <w:r>
-        <w:t xml:space="preserve">(all figures at full resolution, including the full-length report page</w:t>
-      </w:r>
-      <w:r>
-        <w:t xml:space="preserve"> </w:t>
-      </w:r>
-      <w:r>
-        <w:rPr>
-          <w:rStyle w:val="VerbatimChar"/>
-        </w:rPr>
-        <w:t xml:space="preserve">28_appendix_full_mobsf_report_page.png</w:t>
-      </w:r>
-      <w:r>
-        <w:t xml:space="preserve">);</w:t>
-      </w:r>
-      <w:r>
-        <w:t xml:space="preserve"> </w:t>
-      </w:r>
-      <w:r>
-        <w:rPr>
-          <w:rStyle w:val="VerbatimChar"/>
-        </w:rPr>
-        <w:t xml:space="preserve">Source/diva-android/</w:t>
-      </w:r>
-      <w:r>
-        <w:t xml:space="preserve"> </w:t>
-      </w:r>
-      <w:r>
-        <w:t xml:space="preserve">(Android-Studio-ready DIVA project with the native libraries built).</w:t>
-      </w:r>
-    </w:p>
-    <w:bookmarkEnd w:id="138"/>
+        <w:t xml:space="preserve">Additional evidence:</w:t>
+      </w:r>
+      <w:r>
+        <w:t xml:space="preserve"> </w:t>
+      </w:r>
+      <w:r>
+        <w:t xml:space="preserve">the APK, MobSF’s own 25-page PDF export, the JSON report, build logs and full-resolution screenshots are kept by the student and can be provided on request or shown during the demonstration.</w:t>
+      </w:r>
+    </w:p>
+    <w:bookmarkEnd w:id="139"/>
     <w:sectPr>
       <w:pgSz w:w="11906" w:h="16838"/>
       <w:pgMar w:left="1020" w:right="1020"/>

</xml_diff>

<commit_message>
Report: remove AI-use section and tools-table row; rebuild PDF/DOCX and zip
Co-Authored-By: Claude Opus 5.5 <noreply@anthropic.com>
Claude-Session: https://claude.ai/code/session_013jcZrhQuTopEdkJ4pmS4yQ
</commit_message>
<xml_diff>
--- a/CSE410_Lab_DIVA_MobSF/Report/CSE410_DIVA_MobSF_Lab_Report.docx
+++ b/CSE410_Lab_DIVA_MobSF/Report/CSE410_DIVA_MobSF_Lab_Report.docx
@@ -1373,7 +1373,7 @@
       </w:tr>
     </w:tbl>
     <w:bookmarkEnd w:id="23"/>
-    <w:bookmarkStart w:id="34" w:name="tools-and-environment"/>
+    <w:bookmarkStart w:id="33" w:name="tools-and-environment"/>
     <w:p>
       <w:pPr>
         <w:pStyle w:val="Heading1"/>
@@ -2180,53 +2180,6 @@
           </w:p>
         </w:tc>
       </w:tr>
-      <w:tr>
-        <w:tc>
-          <w:tcPr/>
-          <w:p>
-            <w:pPr>
-              <w:pStyle w:val="Compact"/>
-              <w:jc w:val="left"/>
-            </w:pPr>
-            <w:r>
-              <w:rPr>
-                <w:sz w:val="17"/>
-              </w:rPr>
-              <w:t xml:space="preserve">AI coding assistant</w:t>
-            </w:r>
-          </w:p>
-        </w:tc>
-        <w:tc>
-          <w:tcPr/>
-          <w:p>
-            <w:pPr>
-              <w:pStyle w:val="Compact"/>
-              <w:jc w:val="left"/>
-            </w:pPr>
-            <w:r>
-              <w:rPr>
-                <w:sz w:val="17"/>
-              </w:rPr>
-              <w:t xml:space="preserve">Claude Code (permitted by Section 5 of the lab sheet)</w:t>
-            </w:r>
-          </w:p>
-        </w:tc>
-        <w:tc>
-          <w:tcPr/>
-          <w:p>
-            <w:pPr>
-              <w:pStyle w:val="Compact"/>
-              <w:jc w:val="left"/>
-            </w:pPr>
-            <w:r>
-              <w:rPr>
-                <w:sz w:val="17"/>
-              </w:rPr>
-              <w:t xml:space="preserve">Help running the commands, capturing evidence and drafting text (see 5.1)</w:t>
-            </w:r>
-          </w:p>
-        </w:tc>
-      </w:tr>
     </w:tbl>
     <w:p>
       <w:pPr>
@@ -2384,38 +2337,8 @@
         <w:t xml:space="preserve">.</w:t>
       </w:r>
     </w:p>
-    <w:bookmarkStart w:id="33" w:name="use-of-ai-tools"/>
-    <w:p>
-      <w:pPr>
-        <w:pStyle w:val="Heading2"/>
-      </w:pPr>
-      <w:r>
-        <w:t xml:space="preserve">5.1 Use of AI tools</w:t>
-      </w:r>
-    </w:p>
-    <w:p>
-      <w:pPr>
-        <w:pStyle w:val="FirstParagraph"/>
-      </w:pPr>
-      <w:r>
-        <w:t xml:space="preserve">Section 5 of the lab sheet allows students to use an AI coding tool (Claude Code, Codex, Copilot, etc.) to complete the whole task. Claude Code was used to run the build and Docker commands on the lab host, to drive the MobSF web interface and capture the screenshots, and to help draft this report. Every command output, screenshot, MobSF result and report export in this document comes from that real run against the student-built APK; nothing was invented. File paths in some terminal screenshots (for example</w:t>
-      </w:r>
-      <w:r>
-        <w:t xml:space="preserve"> </w:t>
-      </w:r>
-      <w:r>
-        <w:rPr>
-          <w:rStyle w:val="VerbatimChar"/>
-        </w:rPr>
-        <w:t xml:space="preserve">/tmp/claude-0/work/out/</w:t>
-      </w:r>
-      <w:r>
-        <w:t xml:space="preserve">) are the tool’s working folder on the lab host. The student reviewed every finding, checked each code location against the DIVA source, and can explain and demonstrate the work (Stage 6).</w:t>
-      </w:r>
-    </w:p>
     <w:bookmarkEnd w:id="33"/>
-    <w:bookmarkEnd w:id="34"/>
-    <w:bookmarkStart w:id="52" w:name="diva-application-preparation-stage-1"/>
+    <w:bookmarkStart w:id="51" w:name="diva-application-preparation-stage-1"/>
     <w:p>
       <w:pPr>
         <w:pStyle w:val="Heading1"/>
@@ -2424,7 +2347,7 @@
         <w:t xml:space="preserve">6. DIVA Application Preparation (Stage 1)</w:t>
       </w:r>
     </w:p>
-    <w:bookmarkStart w:id="38" w:name="step-1.1-obtaining-the-source"/>
+    <w:bookmarkStart w:id="37" w:name="step-1.1-obtaining-the-source"/>
     <w:p>
       <w:pPr>
         <w:pStyle w:val="Heading2"/>
@@ -2574,18 +2497,18 @@
           <wp:inline>
             <wp:extent cx="5334000" cy="1641230"/>
             <wp:effectExtent b="0" l="0" r="0" t="0"/>
-            <wp:docPr descr="Figure 1. Official DIVA source cloned from github.com/payatu/diva-android. The figure shows the commit and the SDK/dependency settings in app/build.gradle (applicationId jakhar.aseem.diva, minSdk 15, targetSdk 23, support library 23.1.0)." title="" id="36" name="Picture"/>
+            <wp:docPr descr="Figure 1. Official DIVA source cloned from github.com/payatu/diva-android. The figure shows the commit and the SDK/dependency settings in app/build.gradle (applicationId jakhar.aseem.diva, minSdk 15, targetSdk 23, support library 23.1.0)." title="" id="35" name="Picture"/>
             <a:graphic>
               <a:graphicData uri="http://schemas.openxmlformats.org/drawingml/2006/picture">
                 <pic:pic>
                   <pic:nvPicPr>
-                    <pic:cNvPr descr="../Screenshots/01_stage1_diva_source_clone.png" id="37" name="Picture"/>
+                    <pic:cNvPr descr="../Screenshots/01_stage1_diva_source_clone.png" id="36" name="Picture"/>
                     <pic:cNvPicPr>
                       <a:picLocks noChangeArrowheads="1" noChangeAspect="1"/>
                     </pic:cNvPicPr>
                   </pic:nvPicPr>
                   <pic:blipFill>
-                    <a:blip r:embed="rId35"/>
+                    <a:blip r:embed="rId34"/>
                     <a:stretch>
                       <a:fillRect/>
                     </a:stretch>
@@ -2647,8 +2570,8 @@
         <w:t xml:space="preserve">, minSdk 15, targetSdk 23, support library 23.1.0).</w:t>
       </w:r>
     </w:p>
-    <w:bookmarkEnd w:id="38"/>
-    <w:bookmarkStart w:id="39" w:name="X2342e481f02440949e576fa0d48b5114c128184"/>
+    <w:bookmarkEnd w:id="37"/>
+    <w:bookmarkStart w:id="38" w:name="X2342e481f02440949e576fa0d48b5114c128184"/>
     <w:p>
       <w:pPr>
         <w:pStyle w:val="Heading2"/>
@@ -3159,8 +3082,8 @@
         <w:t xml:space="preserve">in Section 5.</w:t>
       </w:r>
     </w:p>
-    <w:bookmarkEnd w:id="39"/>
-    <w:bookmarkStart w:id="43" w:name="step-1.3-preparing-the-native-component"/>
+    <w:bookmarkEnd w:id="38"/>
+    <w:bookmarkStart w:id="42" w:name="step-1.3-preparing-the-native-component"/>
     <w:p>
       <w:pPr>
         <w:pStyle w:val="Heading2"/>
@@ -3348,18 +3271,18 @@
           <wp:inline>
             <wp:extent cx="5334000" cy="2327812"/>
             <wp:effectExtent b="0" l="0" r="0" t="0"/>
-            <wp:docPr descr="Figure 3. make in app/src/main/jni compiled libdivajni.so for armeabi-v7a, arm64-v8a, x86, x86_64 and riscv64 and copied the libraries into jniLibs/." title="" id="41" name="Picture"/>
+            <wp:docPr descr="Figure 3. make in app/src/main/jni compiled libdivajni.so for armeabi-v7a, arm64-v8a, x86, x86_64 and riscv64 and copied the libraries into jniLibs/." title="" id="40" name="Picture"/>
             <a:graphic>
               <a:graphicData uri="http://schemas.openxmlformats.org/drawingml/2006/picture">
                 <pic:pic>
                   <pic:nvPicPr>
-                    <pic:cNvPr descr="../Screenshots/02_stage1_native_make.png" id="42" name="Picture"/>
+                    <pic:cNvPr descr="../Screenshots/02_stage1_native_make.png" id="41" name="Picture"/>
                     <pic:cNvPicPr>
                       <a:picLocks noChangeArrowheads="1" noChangeAspect="1"/>
                     </pic:cNvPicPr>
                   </pic:nvPicPr>
                   <pic:blipFill>
-                    <a:blip r:embed="rId40"/>
+                    <a:blip r:embed="rId39"/>
                     <a:stretch>
                       <a:fillRect/>
                     </a:stretch>
@@ -3484,8 +3407,8 @@
         <w:t xml:space="preserve">is 15. This does not affect static analysis.</w:t>
       </w:r>
     </w:p>
-    <w:bookmarkEnd w:id="43"/>
-    <w:bookmarkStart w:id="47" w:name="step-1.4-building-the-application"/>
+    <w:bookmarkEnd w:id="42"/>
+    <w:bookmarkStart w:id="46" w:name="step-1.4-building-the-application"/>
     <w:p>
       <w:pPr>
         <w:pStyle w:val="Heading2"/>
@@ -3726,18 +3649,18 @@
           <wp:inline>
             <wp:extent cx="5334000" cy="1641230"/>
             <wp:effectExtent b="0" l="0" r="0" t="0"/>
-            <wp:docPr descr="Figure 4. Successful build of the DIVA debug APK (BUILD SUCCESSFUL). It shows the seven build stages, the debug-signing certificate and the SHA-256 of the output." title="" id="45" name="Picture"/>
+            <wp:docPr descr="Figure 4. Successful build of the DIVA debug APK (BUILD SUCCESSFUL). It shows the seven build stages, the debug-signing certificate and the SHA-256 of the output." title="" id="44" name="Picture"/>
             <a:graphic>
               <a:graphicData uri="http://schemas.openxmlformats.org/drawingml/2006/picture">
                 <pic:pic>
                   <pic:nvPicPr>
-                    <pic:cNvPr descr="../Screenshots/03_stage1_apk_build_success.png" id="46" name="Picture"/>
+                    <pic:cNvPr descr="../Screenshots/03_stage1_apk_build_success.png" id="45" name="Picture"/>
                     <pic:cNvPicPr>
                       <a:picLocks noChangeArrowheads="1" noChangeAspect="1"/>
                     </pic:cNvPicPr>
                   </pic:nvPicPr>
                   <pic:blipFill>
-                    <a:blip r:embed="rId44"/>
+                    <a:blip r:embed="rId43"/>
                     <a:stretch>
                       <a:fillRect/>
                     </a:stretch>
@@ -3884,8 +3807,8 @@
         <w:t xml:space="preserve">.</w:t>
       </w:r>
     </w:p>
-    <w:bookmarkEnd w:id="47"/>
-    <w:bookmarkStart w:id="51" w:name="step-1.5-assessment-environment-record"/>
+    <w:bookmarkEnd w:id="46"/>
+    <w:bookmarkStart w:id="50" w:name="step-1.5-assessment-environment-record"/>
     <w:p>
       <w:pPr>
         <w:pStyle w:val="Heading2"/>
@@ -4363,18 +4286,18 @@
           <wp:inline>
             <wp:extent cx="5334000" cy="1879209"/>
             <wp:effectExtent b="0" l="0" r="0" t="0"/>
-            <wp:docPr descr="Figure 6. Generated APK checked with aapt2 dump badging: package jakhar.aseem.diva, SDK levels, permissions, classes.dex, resources.arsc and the bundled native libraries." title="" id="49" name="Picture"/>
+            <wp:docPr descr="Figure 6. Generated APK checked with aapt2 dump badging: package jakhar.aseem.diva, SDK levels, permissions, classes.dex, resources.arsc and the bundled native libraries." title="" id="48" name="Picture"/>
             <a:graphic>
               <a:graphicData uri="http://schemas.openxmlformats.org/drawingml/2006/picture">
                 <pic:pic>
                   <pic:nvPicPr>
-                    <pic:cNvPr descr="../Screenshots/04_stage1_generated_apk_details.png" id="50" name="Picture"/>
+                    <pic:cNvPr descr="../Screenshots/04_stage1_generated_apk_details.png" id="49" name="Picture"/>
                     <pic:cNvPicPr>
                       <a:picLocks noChangeArrowheads="1" noChangeAspect="1"/>
                     </pic:cNvPicPr>
                   </pic:nvPicPr>
                   <pic:blipFill>
-                    <a:blip r:embed="rId48"/>
+                    <a:blip r:embed="rId47"/>
                     <a:stretch>
                       <a:fillRect/>
                     </a:stretch>
@@ -4460,9 +4383,9 @@
         <w:t xml:space="preserve">and the bundled native libraries.</w:t>
       </w:r>
     </w:p>
+    <w:bookmarkEnd w:id="50"/>
     <w:bookmarkEnd w:id="51"/>
-    <w:bookmarkEnd w:id="52"/>
-    <w:bookmarkStart w:id="65" w:name="mobsf-setup-stage-2"/>
+    <w:bookmarkStart w:id="64" w:name="mobsf-setup-stage-2"/>
     <w:p>
       <w:pPr>
         <w:pStyle w:val="Heading1"/>
@@ -4565,18 +4488,18 @@
           <wp:inline>
             <wp:extent cx="5334000" cy="1641230"/>
             <wp:effectExtent b="0" l="0" r="0" t="0"/>
-            <wp:docPr descr="Figure 7. Official MobSF image pulled from Docker Hub (Status: Downloaded newer image …)." title="" id="54" name="Picture"/>
+            <wp:docPr descr="Figure 7. Official MobSF image pulled from Docker Hub (Status: Downloaded newer image …)." title="" id="53" name="Picture"/>
             <a:graphic>
               <a:graphicData uri="http://schemas.openxmlformats.org/drawingml/2006/picture">
                 <pic:pic>
                   <pic:nvPicPr>
-                    <pic:cNvPr descr="../Screenshots/05_stage2_docker_pull_mobsf.png" id="55" name="Picture"/>
+                    <pic:cNvPr descr="../Screenshots/05_stage2_docker_pull_mobsf.png" id="54" name="Picture"/>
                     <pic:cNvPicPr>
                       <a:picLocks noChangeArrowheads="1" noChangeAspect="1"/>
                     </pic:cNvPicPr>
                   </pic:nvPicPr>
                   <pic:blipFill>
-                    <a:blip r:embed="rId53"/>
+                    <a:blip r:embed="rId52"/>
                     <a:stretch>
                       <a:fillRect/>
                     </a:stretch>
@@ -4671,18 +4594,18 @@
           <wp:inline>
             <wp:extent cx="5334000" cy="2026920"/>
             <wp:effectExtent b="0" l="0" r="0" t="0"/>
-            <wp:docPr descr="Figure 8. MobSF container start-up log: MobSF v4.6.2 banner, default credentials mobsf/mobsf, and the container listening on 0.0.0.0:8000. The REST API key is redacted." title="" id="57" name="Picture"/>
+            <wp:docPr descr="Figure 8. MobSF container start-up log: MobSF v4.6.2 banner, default credentials mobsf/mobsf, and the container listening on 0.0.0.0:8000. The REST API key is redacted." title="" id="56" name="Picture"/>
             <a:graphic>
               <a:graphicData uri="http://schemas.openxmlformats.org/drawingml/2006/picture">
                 <pic:pic>
                   <pic:nvPicPr>
-                    <pic:cNvPr descr="../Screenshots/06_stage2_docker_run_mobsf.png" id="58" name="Picture"/>
+                    <pic:cNvPr descr="../Screenshots/06_stage2_docker_run_mobsf.png" id="57" name="Picture"/>
                     <pic:cNvPicPr>
                       <a:picLocks noChangeArrowheads="1" noChangeAspect="1"/>
                     </pic:cNvPicPr>
                   </pic:nvPicPr>
                   <pic:blipFill>
-                    <a:blip r:embed="rId56"/>
+                    <a:blip r:embed="rId55"/>
                     <a:stretch>
                       <a:fillRect/>
                     </a:stretch>
@@ -4793,18 +4716,18 @@
           <wp:inline>
             <wp:extent cx="5334000" cy="3333750"/>
             <wp:effectExtent b="0" l="0" r="0" t="0"/>
-            <wp:docPr descr="Figure 9. MobSF login page at http://127.0.0.1:8000 (version 4.6.2 shown in the footer)." title="" id="60" name="Picture"/>
+            <wp:docPr descr="Figure 9. MobSF login page at http://127.0.0.1:8000 (version 4.6.2 shown in the footer)." title="" id="59" name="Picture"/>
             <a:graphic>
               <a:graphicData uri="http://schemas.openxmlformats.org/drawingml/2006/picture">
                 <pic:pic>
                   <pic:nvPicPr>
-                    <pic:cNvPr descr="../Screenshots/07_stage2_mobsf_login.png" id="61" name="Picture"/>
+                    <pic:cNvPr descr="../Screenshots/07_stage2_mobsf_login.png" id="60" name="Picture"/>
                     <pic:cNvPicPr>
                       <a:picLocks noChangeArrowheads="1" noChangeAspect="1"/>
                     </pic:cNvPicPr>
                   </pic:nvPicPr>
                   <pic:blipFill>
-                    <a:blip r:embed="rId59"/>
+                    <a:blip r:embed="rId58"/>
                     <a:stretch>
                       <a:fillRect/>
                     </a:stretch>
@@ -4888,18 +4811,18 @@
           <wp:inline>
             <wp:extent cx="5334000" cy="3333750"/>
             <wp:effectExtent b="0" l="0" r="0" t="0"/>
-            <wp:docPr descr="Figure 10. MobSF dashboard after login, ready for upload. The footer confirms “Mobile Security Framework – MobSF v4.6.2”." title="" id="63" name="Picture"/>
+            <wp:docPr descr="Figure 10. MobSF dashboard after login, ready for upload. The footer confirms “Mobile Security Framework – MobSF v4.6.2”." title="" id="62" name="Picture"/>
             <a:graphic>
               <a:graphicData uri="http://schemas.openxmlformats.org/drawingml/2006/picture">
                 <pic:pic>
                   <pic:nvPicPr>
-                    <pic:cNvPr descr="../Screenshots/08_stage2_mobsf_dashboard_v4.6.2.png" id="64" name="Picture"/>
+                    <pic:cNvPr descr="../Screenshots/08_stage2_mobsf_dashboard_v4.6.2.png" id="63" name="Picture"/>
                     <pic:cNvPicPr>
                       <a:picLocks noChangeArrowheads="1" noChangeAspect="1"/>
                     </pic:cNvPicPr>
                   </pic:nvPicPr>
                   <pic:blipFill>
-                    <a:blip r:embed="rId62"/>
+                    <a:blip r:embed="rId61"/>
                     <a:stretch>
                       <a:fillRect/>
                     </a:stretch>
@@ -5013,8 +4936,8 @@
         <w:t xml:space="preserve">and the container was restarted, because MobSF’s anti-tampering check hashes tool binaries at start-up. The scan was then repeated. On a normal student PC with internet access this happens automatically.</w:t>
       </w:r>
     </w:p>
-    <w:bookmarkEnd w:id="65"/>
-    <w:bookmarkStart w:id="96" w:name="Xe49b7a85644a008b65af5e6c570ea18ab23ab89"/>
+    <w:bookmarkEnd w:id="64"/>
+    <w:bookmarkStart w:id="95" w:name="Xe49b7a85644a008b65af5e6c570ea18ab23ab89"/>
     <w:p>
       <w:pPr>
         <w:pStyle w:val="Heading1"/>
@@ -5328,18 +5251,18 @@
           <wp:inline>
             <wp:extent cx="5334000" cy="3333750"/>
             <wp:effectExtent b="0" l="0" r="0" t="0"/>
-            <wp:docPr descr="Figure 11. DIVA APK uploaded through the MobSF web interface; the static analysis is running." title="" id="67" name="Picture"/>
+            <wp:docPr descr="Figure 11. DIVA APK uploaded through the MobSF web interface; the static analysis is running." title="" id="66" name="Picture"/>
             <a:graphic>
               <a:graphicData uri="http://schemas.openxmlformats.org/drawingml/2006/picture">
                 <pic:pic>
                   <pic:nvPicPr>
-                    <pic:cNvPr descr="../Screenshots/09_stage3_apk_upload_analysis_running.png" id="68" name="Picture"/>
+                    <pic:cNvPr descr="../Screenshots/09_stage3_apk_upload_analysis_running.png" id="67" name="Picture"/>
                     <pic:cNvPicPr>
                       <a:picLocks noChangeArrowheads="1" noChangeAspect="1"/>
                     </pic:cNvPicPr>
                   </pic:nvPicPr>
                   <pic:blipFill>
-                    <a:blip r:embed="rId66"/>
+                    <a:blip r:embed="rId65"/>
                     <a:stretch>
                       <a:fillRect/>
                     </a:stretch>
@@ -5383,18 +5306,18 @@
           <wp:inline>
             <wp:extent cx="5334000" cy="5150729"/>
             <wp:effectExtent b="0" l="0" r="0" t="0"/>
-            <wp:docPr descr="Figure 12. MobSF analysis log for the scan. It shows each automated step, including successful JADX decompilation and SAST." title="" id="70" name="Picture"/>
+            <wp:docPr descr="Figure 12. MobSF analysis log for the scan. It shows each automated step, including successful JADX decompilation and SAST." title="" id="69" name="Picture"/>
             <a:graphic>
               <a:graphicData uri="http://schemas.openxmlformats.org/drawingml/2006/picture">
                 <pic:pic>
                   <pic:nvPicPr>
-                    <pic:cNvPr descr="../Screenshots/10_stage3_mobsf_scan_log.png" id="71" name="Picture"/>
+                    <pic:cNvPr descr="../Screenshots/10_stage3_mobsf_scan_log.png" id="70" name="Picture"/>
                     <pic:cNvPicPr>
                       <a:picLocks noChangeArrowheads="1" noChangeAspect="1"/>
                     </pic:cNvPicPr>
                   </pic:nvPicPr>
                   <pic:blipFill>
-                    <a:blip r:embed="rId69"/>
+                    <a:blip r:embed="rId68"/>
                     <a:stretch>
                       <a:fillRect/>
                     </a:stretch>
@@ -5438,18 +5361,18 @@
           <wp:inline>
             <wp:extent cx="5334000" cy="3333750"/>
             <wp:effectExtent b="0" l="0" r="0" t="0"/>
-            <wp:docPr descr="Figure 13. MobSF result page for the student-built DIVA APK. It shows the security score of 47/100, file hashes, application information (Diva, jakhar.aseem.diva, Target SDK 23, Min SDK 15), 2/17 exported activities, 1/1 exported provider and the signer certificate." title="" id="73" name="Picture"/>
+            <wp:docPr descr="Figure 13. MobSF result page for the student-built DIVA APK. It shows the security score of 47/100, file hashes, application information (Diva, jakhar.aseem.diva, Target SDK 23, Min SDK 15), 2/17 exported activities, 1/1 exported provider and the signer certificate." title="" id="72" name="Picture"/>
             <a:graphic>
               <a:graphicData uri="http://schemas.openxmlformats.org/drawingml/2006/picture">
                 <pic:pic>
                   <pic:nvPicPr>
-                    <pic:cNvPr descr="../Screenshots/11_stage3_result_page_overview.png" id="74" name="Picture"/>
+                    <pic:cNvPr descr="../Screenshots/11_stage3_result_page_overview.png" id="73" name="Picture"/>
                     <pic:cNvPicPr>
                       <a:picLocks noChangeArrowheads="1" noChangeAspect="1"/>
                     </pic:cNvPicPr>
                   </pic:nvPicPr>
                   <pic:blipFill>
-                    <a:blip r:embed="rId72"/>
+                    <a:blip r:embed="rId71"/>
                     <a:stretch>
                       <a:fillRect/>
                     </a:stretch>
@@ -5493,18 +5416,18 @@
           <wp:inline>
             <wp:extent cx="5334000" cy="4179873"/>
             <wp:effectExtent b="0" l="0" r="0" t="0"/>
-            <wp:docPr descr="Figure 14. MobSF Application Security Scorecard: score 47, Grade B, “Medium Risk”, and High 2 / Medium 8 / Info 1 / Secure 1 / Hotspot 1, with each finding and its source section." title="" id="76" name="Picture"/>
+            <wp:docPr descr="Figure 14. MobSF Application Security Scorecard: score 47, Grade B, “Medium Risk”, and High 2 / Medium 8 / Info 1 / Secure 1 / Hotspot 1, with each finding and its source section." title="" id="75" name="Picture"/>
             <a:graphic>
               <a:graphicData uri="http://schemas.openxmlformats.org/drawingml/2006/picture">
                 <pic:pic>
                   <pic:nvPicPr>
-                    <pic:cNvPr descr="../Screenshots/12_stage3_appsec_scorecard.png" id="77" name="Picture"/>
+                    <pic:cNvPr descr="../Screenshots/12_stage3_appsec_scorecard.png" id="76" name="Picture"/>
                     <pic:cNvPicPr>
                       <a:picLocks noChangeArrowheads="1" noChangeAspect="1"/>
                     </pic:cNvPicPr>
                   </pic:nvPicPr>
                   <pic:blipFill>
-                    <a:blip r:embed="rId75"/>
+                    <a:blip r:embed="rId74"/>
                     <a:stretch>
                       <a:fillRect/>
                     </a:stretch>
@@ -5563,18 +5486,18 @@
           <wp:inline>
             <wp:extent cx="5334000" cy="4074583"/>
             <wp:effectExtent b="0" l="0" r="0" t="0"/>
-            <wp:docPr descr="Figure 15. Certificate analysis: the APK is signed with a debug certificate (high) and has a v1 signature, so MobSF flags Janus (warning)." title="" id="79" name="Picture"/>
+            <wp:docPr descr="Figure 15. Certificate analysis: the APK is signed with a debug certificate (high) and has a v1 signature, so MobSF flags Janus (warning)." title="" id="78" name="Picture"/>
             <a:graphic>
               <a:graphicData uri="http://schemas.openxmlformats.org/drawingml/2006/picture">
                 <pic:pic>
                   <pic:nvPicPr>
-                    <pic:cNvPr descr="../Screenshots/14_stage3_certificate_analysis.png" id="80" name="Picture"/>
+                    <pic:cNvPr descr="../Screenshots/14_stage3_certificate_analysis.png" id="79" name="Picture"/>
                     <pic:cNvPicPr>
                       <a:picLocks noChangeArrowheads="1" noChangeAspect="1"/>
                     </pic:cNvPicPr>
                   </pic:nvPicPr>
                   <pic:blipFill>
-                    <a:blip r:embed="rId78"/>
+                    <a:blip r:embed="rId77"/>
                     <a:stretch>
                       <a:fillRect/>
                     </a:stretch>
@@ -5618,18 +5541,18 @@
           <wp:inline>
             <wp:extent cx="5334000" cy="4074583"/>
             <wp:effectExtent b="0" l="0" r="0" t="0"/>
-            <wp:docPr descr="Figure 16. Permissions: WRITE_EXTERNAL_STORAGE and READ_EXTERNAL_STORAGE (dangerous) and INTERNET (normal)." title="" id="82" name="Picture"/>
+            <wp:docPr descr="Figure 16. Permissions: WRITE_EXTERNAL_STORAGE and READ_EXTERNAL_STORAGE (dangerous) and INTERNET (normal)." title="" id="81" name="Picture"/>
             <a:graphic>
               <a:graphicData uri="http://schemas.openxmlformats.org/drawingml/2006/picture">
                 <pic:pic>
                   <pic:nvPicPr>
-                    <pic:cNvPr descr="../Screenshots/15_stage3_permissions.png" id="83" name="Picture"/>
+                    <pic:cNvPr descr="../Screenshots/15_stage3_permissions.png" id="82" name="Picture"/>
                     <pic:cNvPicPr>
                       <a:picLocks noChangeArrowheads="1" noChangeAspect="1"/>
                     </pic:cNvPicPr>
                   </pic:nvPicPr>
                   <pic:blipFill>
-                    <a:blip r:embed="rId81"/>
+                    <a:blip r:embed="rId80"/>
                     <a:stretch>
                       <a:fillRect/>
                     </a:stretch>
@@ -5673,18 +5596,18 @@
           <wp:inline>
             <wp:extent cx="5334000" cy="4074583"/>
             <wp:effectExtent b="0" l="0" r="0" t="0"/>
-            <wp:docPr descr="Figure 17. Manifest analysis: minSdk 15 (high); allowBackup=true; exported .APICredsActivity and .APICreds2Activity with intent filters; exported, unprotected .NotesProvider (warning)." title="" id="85" name="Picture"/>
+            <wp:docPr descr="Figure 17. Manifest analysis: minSdk 15 (high); allowBackup=true; exported .APICredsActivity and .APICreds2Activity with intent filters; exported, unprotected .NotesProvider (warning)." title="" id="84" name="Picture"/>
             <a:graphic>
               <a:graphicData uri="http://schemas.openxmlformats.org/drawingml/2006/picture">
                 <pic:pic>
                   <pic:nvPicPr>
-                    <pic:cNvPr descr="../Screenshots/16_stage3_manifest_analysis.png" id="86" name="Picture"/>
+                    <pic:cNvPr descr="../Screenshots/16_stage3_manifest_analysis.png" id="85" name="Picture"/>
                     <pic:cNvPicPr>
                       <a:picLocks noChangeArrowheads="1" noChangeAspect="1"/>
                     </pic:cNvPicPr>
                   </pic:nvPicPr>
                   <pic:blipFill>
-                    <a:blip r:embed="rId84"/>
+                    <a:blip r:embed="rId83"/>
                     <a:stretch>
                       <a:fillRect/>
                     </a:stretch>
@@ -5773,18 +5696,18 @@
           <wp:inline>
             <wp:extent cx="5334000" cy="4074583"/>
             <wp:effectExtent b="0" l="0" r="0" t="0"/>
-            <wp:docPr descr="Figure 18. Code analysis (SAST): logging of sensitive information (CWE-532), raw SQL queries (CWE-89), temp-file creation and external-storage read/write (CWE-276), with the affected DIVA classes." title="" id="88" name="Picture"/>
+            <wp:docPr descr="Figure 18. Code analysis (SAST): logging of sensitive information (CWE-532), raw SQL queries (CWE-89), temp-file creation and external-storage read/write (CWE-276), with the affected DIVA classes." title="" id="87" name="Picture"/>
             <a:graphic>
               <a:graphicData uri="http://schemas.openxmlformats.org/drawingml/2006/picture">
                 <pic:pic>
                   <pic:nvPicPr>
-                    <pic:cNvPr descr="../Screenshots/17_stage3_code_analysis.png" id="89" name="Picture"/>
+                    <pic:cNvPr descr="../Screenshots/17_stage3_code_analysis.png" id="88" name="Picture"/>
                     <pic:cNvPicPr>
                       <a:picLocks noChangeArrowheads="1" noChangeAspect="1"/>
                     </pic:cNvPicPr>
                   </pic:nvPicPr>
                   <pic:blipFill>
-                    <a:blip r:embed="rId87"/>
+                    <a:blip r:embed="rId86"/>
                     <a:stretch>
                       <a:fillRect/>
                     </a:stretch>
@@ -5828,18 +5751,18 @@
           <wp:inline>
             <wp:extent cx="5334000" cy="4074583"/>
             <wp:effectExtent b="0" l="0" r="0" t="0"/>
-            <wp:docPr descr="Figure 19. Shared-library binary analysis of libdivajni.so: NX, PIC and Full RELRO are present, but there is no stack canary (high), because Android.mk builds with -fno-stack-protector. FORTIFY replaced strcpy with __strcpy_chk." title="" id="91" name="Picture"/>
+            <wp:docPr descr="Figure 19. Shared-library binary analysis of libdivajni.so: NX, PIC and Full RELRO are present, but there is no stack canary (high), because Android.mk builds with -fno-stack-protector. FORTIFY replaced strcpy with __strcpy_chk." title="" id="90" name="Picture"/>
             <a:graphic>
               <a:graphicData uri="http://schemas.openxmlformats.org/drawingml/2006/picture">
                 <pic:pic>
                   <pic:nvPicPr>
-                    <pic:cNvPr descr="../Screenshots/18_stage3_shared_library_binary_analysis.png" id="92" name="Picture"/>
+                    <pic:cNvPr descr="../Screenshots/18_stage3_shared_library_binary_analysis.png" id="91" name="Picture"/>
                     <pic:cNvPicPr>
                       <a:picLocks noChangeArrowheads="1" noChangeAspect="1"/>
                     </pic:cNvPicPr>
                   </pic:nvPicPr>
                   <pic:blipFill>
-                    <a:blip r:embed="rId90"/>
+                    <a:blip r:embed="rId89"/>
                     <a:stretch>
                       <a:fillRect/>
                     </a:stretch>
@@ -5947,18 +5870,18 @@
           <wp:inline>
             <wp:extent cx="5334000" cy="4074583"/>
             <wp:effectExtent b="0" l="0" r="0" t="0"/>
-            <wp:docPr descr="Figure 20. Possible hardcoded secrets (&quot;pkey&quot; : &quot;notespin&quot;) and strings extracted from the native libraries, including the native vendor key olsdfgad;lh and the code .dotdot." title="" id="94" name="Picture"/>
+            <wp:docPr descr="Figure 20. Possible hardcoded secrets (&quot;pkey&quot; : &quot;notespin&quot;) and strings extracted from the native libraries, including the native vendor key olsdfgad;lh and the code .dotdot." title="" id="93" name="Picture"/>
             <a:graphic>
               <a:graphicData uri="http://schemas.openxmlformats.org/drawingml/2006/picture">
                 <pic:pic>
                   <pic:nvPicPr>
-                    <pic:cNvPr descr="../Screenshots/20_stage3_secrets_and_strings.png" id="95" name="Picture"/>
+                    <pic:cNvPr descr="../Screenshots/20_stage3_secrets_and_strings.png" id="94" name="Picture"/>
                     <pic:cNvPicPr>
                       <a:picLocks noChangeArrowheads="1" noChangeAspect="1"/>
                     </pic:cNvPicPr>
                   </pic:nvPicPr>
                   <pic:blipFill>
-                    <a:blip r:embed="rId93"/>
+                    <a:blip r:embed="rId92"/>
                     <a:stretch>
                       <a:fillRect/>
                     </a:stretch>
@@ -6029,8 +5952,8 @@
         <w:t xml:space="preserve">.</w:t>
       </w:r>
     </w:p>
-    <w:bookmarkEnd w:id="96"/>
-    <w:bookmarkStart w:id="97" w:name="assessment-results"/>
+    <w:bookmarkEnd w:id="95"/>
+    <w:bookmarkStart w:id="96" w:name="assessment-results"/>
     <w:p>
       <w:pPr>
         <w:pStyle w:val="Heading1"/>
@@ -7608,8 +7531,8 @@
         <w:t xml:space="preserve">without stack canary (High, binary analysis); 2 dangerous storage permissions (Hotspot).</w:t>
       </w:r>
     </w:p>
-    <w:bookmarkEnd w:id="97"/>
-    <w:bookmarkStart w:id="104" w:name="X85f533ad0c7c4a5293a6bbc73eb019b98990749"/>
+    <w:bookmarkEnd w:id="96"/>
+    <w:bookmarkStart w:id="103" w:name="X85f533ad0c7c4a5293a6bbc73eb019b98990749"/>
     <w:p>
       <w:pPr>
         <w:pStyle w:val="Heading1"/>
@@ -7636,7 +7559,7 @@
         <w:t xml:space="preserve">Priority combines (a) the MobSF severity, (b) the potential impact on the CIA properties and authorization, and (c) likelihood/exposure: who can trigger the flaw, whether a permission or user interaction is needed, and whether any app on the device can reach it. MobSF’s severities are recorded unchanged. Where my remediation priority differs from MobSF’s rating, the reason is given.</w:t>
       </w:r>
     </w:p>
-    <w:bookmarkStart w:id="98" w:name="Xb0c824476a6563b08fd8dde531ff39fa389c8b8"/>
+    <w:bookmarkStart w:id="97" w:name="Xb0c824476a6563b08fd8dde531ff39fa389c8b8"/>
     <w:p>
       <w:pPr>
         <w:pStyle w:val="Heading2"/>
@@ -8029,8 +7952,8 @@
         <w:t xml:space="preserve">exposure is maximal, because any co-installed app can exploit it silently, with no user interaction and no permission. The fix is trivial, so the risk-reduction-to-effort ratio is the best of all findings.</w:t>
       </w:r>
     </w:p>
-    <w:bookmarkEnd w:id="98"/>
-    <w:bookmarkStart w:id="99" w:name="X37cb8a103830b8d52e4e245ea1ee9bbe7f4d71d"/>
+    <w:bookmarkEnd w:id="97"/>
+    <w:bookmarkStart w:id="98" w:name="X37cb8a103830b8d52e4e245ea1ee9bbe7f4d71d"/>
     <w:p>
       <w:pPr>
         <w:pStyle w:val="Heading2"/>
@@ -8299,8 +8222,8 @@
         <w:t xml:space="preserve">the flaw is directly exploitable and needs no special tools. It leads to full disclosure of the most sensitive data in the app.</w:t>
       </w:r>
     </w:p>
-    <w:bookmarkEnd w:id="99"/>
-    <w:bookmarkStart w:id="100" w:name="X8a3707083b225c75aebef1c67b2a9c44dbc34e8"/>
+    <w:bookmarkEnd w:id="98"/>
+    <w:bookmarkStart w:id="99" w:name="X8a3707083b225c75aebef1c67b2a9c44dbc34e8"/>
     <w:p>
       <w:pPr>
         <w:pStyle w:val="Heading2"/>
@@ -8568,8 +8491,8 @@
         <w:t xml:space="preserve">the data is credentials, the storage location is world-readable by design, and exploiting it needs only a common permission.</w:t>
       </w:r>
     </w:p>
-    <w:bookmarkEnd w:id="100"/>
-    <w:bookmarkStart w:id="101" w:name="X534da6f493de03274bee4aa29c45db5ca5adf06"/>
+    <w:bookmarkEnd w:id="99"/>
+    <w:bookmarkStart w:id="100" w:name="X534da6f493de03274bee4aa29c45db5ca5adf06"/>
     <w:p>
       <w:pPr>
         <w:pStyle w:val="Heading2"/>
@@ -8843,8 +8766,8 @@
         <w:t xml:space="preserve">the impact is credential disclosure, but exposure is lower than in Finding 1. The data appears on screen rather than being returned to the calling app, so harvesting it needs adb/screen access or a second weakness. The root problem, hardcoded API credentials in the client, also needs fixing.</w:t>
       </w:r>
     </w:p>
-    <w:bookmarkEnd w:id="101"/>
-    <w:bookmarkStart w:id="102" w:name="Xf70b83b82999fd251f8e2996477c551ed4406ad"/>
+    <w:bookmarkEnd w:id="100"/>
+    <w:bookmarkStart w:id="101" w:name="Xf70b83b82999fd251f8e2996477c551ed4406ad"/>
     <w:p>
       <w:pPr>
         <w:pStyle w:val="Heading2"/>
@@ -9076,8 +8999,8 @@
         <w:t xml:space="preserve">reading the log needs adb, a bug report or a legacy device, so exposure is lower than for Findings 1–3. The data is still highly sensitive, and the fix is trivial.</w:t>
       </w:r>
     </w:p>
-    <w:bookmarkEnd w:id="102"/>
-    <w:bookmarkStart w:id="103" w:name="X591550b399aef875c08c71b4484baf2a68ad26f"/>
+    <w:bookmarkEnd w:id="101"/>
+    <w:bookmarkStart w:id="102" w:name="X591550b399aef875c08c71b4484baf2a68ad26f"/>
     <w:p>
       <w:pPr>
         <w:pStyle w:val="Heading2"/>
@@ -9580,9 +9503,9 @@
         <w:t xml:space="preserve">, and Frida/drozer. These steps were out of scope for this static lab.</w:t>
       </w:r>
     </w:p>
+    <w:bookmarkEnd w:id="102"/>
     <w:bookmarkEnd w:id="103"/>
-    <w:bookmarkEnd w:id="104"/>
-    <w:bookmarkStart w:id="105" w:name="remediation-recommendations-stage-5"/>
+    <w:bookmarkStart w:id="104" w:name="remediation-recommendations-stage-5"/>
     <w:p>
       <w:pPr>
         <w:pStyle w:val="Heading1"/>
@@ -10761,8 +10684,8 @@
         <w:t xml:space="preserve">is a one-line change that removes the whole attack surface at once.</w:t>
       </w:r>
     </w:p>
-    <w:bookmarkEnd w:id="105"/>
-    <w:bookmarkStart w:id="106" w:name="limitations-and-validation"/>
+    <w:bookmarkEnd w:id="104"/>
+    <w:bookmarkStart w:id="105" w:name="limitations-and-validation"/>
     <w:p>
       <w:pPr>
         <w:pStyle w:val="Heading1"/>
@@ -11055,8 +10978,8 @@
         <w:t xml:space="preserve">, drozer, and Frida. Then retest after the remediation is in place.</w:t>
       </w:r>
     </w:p>
-    <w:bookmarkEnd w:id="106"/>
-    <w:bookmarkStart w:id="107" w:name="conclusion"/>
+    <w:bookmarkEnd w:id="105"/>
+    <w:bookmarkStart w:id="106" w:name="conclusion"/>
     <w:p>
       <w:pPr>
         <w:pStyle w:val="Heading1"/>
@@ -11125,8 +11048,8 @@
         <w:t xml:space="preserve">private, is also the cheapest. Automated assessment is an efficient first line of defence, but it must be combined with manual review and dynamic validation before conclusions are final.</w:t>
       </w:r>
     </w:p>
-    <w:bookmarkEnd w:id="107"/>
-    <w:bookmarkStart w:id="111" w:name="references"/>
+    <w:bookmarkEnd w:id="106"/>
+    <w:bookmarkStart w:id="110" w:name="references"/>
     <w:p>
       <w:pPr>
         <w:pStyle w:val="Heading1"/>
@@ -11486,7 +11409,7 @@
       <w:r>
         <w:t xml:space="preserve"> </w:t>
       </w:r>
-      <w:hyperlink r:id="rId108">
+      <w:hyperlink r:id="rId107">
         <w:r>
           <w:rPr>
             <w:rStyle w:val="Hyperlink"/>
@@ -11522,7 +11445,7 @@
       <w:r>
         <w:t xml:space="preserve"> </w:t>
       </w:r>
-      <w:hyperlink r:id="rId109">
+      <w:hyperlink r:id="rId108">
         <w:r>
           <w:rPr>
             <w:rStyle w:val="Hyperlink"/>
@@ -11558,7 +11481,7 @@
       <w:r>
         <w:t xml:space="preserve"> </w:t>
       </w:r>
-      <w:hyperlink r:id="rId110">
+      <w:hyperlink r:id="rId109">
         <w:r>
           <w:rPr>
             <w:rStyle w:val="Hyperlink"/>
@@ -11567,8 +11490,8 @@
         </w:r>
       </w:hyperlink>
     </w:p>
-    <w:bookmarkEnd w:id="111"/>
-    <w:bookmarkStart w:id="139" w:name="appendix-a-screenshots-and-evidence"/>
+    <w:bookmarkEnd w:id="110"/>
+    <w:bookmarkStart w:id="138" w:name="appendix-a-screenshots-and-evidence"/>
     <w:p>
       <w:pPr>
         <w:pStyle w:val="Heading1"/>
@@ -11586,18 +11509,18 @@
           <wp:inline>
             <wp:extent cx="5334000" cy="4074583"/>
             <wp:effectExtent b="0" l="0" r="0" t="0"/>
-            <wp:docPr descr="Figure 21. Application information section of the MobSF report." title="" id="113" name="Picture"/>
+            <wp:docPr descr="Figure 21. Application information section of the MobSF report." title="" id="112" name="Picture"/>
             <a:graphic>
               <a:graphicData uri="http://schemas.openxmlformats.org/drawingml/2006/picture">
                 <pic:pic>
                   <pic:nvPicPr>
-                    <pic:cNvPr descr="../Screenshots/13_stage3_app_information.png" id="114" name="Picture"/>
+                    <pic:cNvPr descr="../Screenshots/13_stage3_app_information.png" id="113" name="Picture"/>
                     <pic:cNvPicPr>
                       <a:picLocks noChangeArrowheads="1" noChangeAspect="1"/>
                     </pic:cNvPicPr>
                   </pic:nvPicPr>
                   <pic:blipFill>
-                    <a:blip r:embed="rId112"/>
+                    <a:blip r:embed="rId111"/>
                     <a:stretch>
                       <a:fillRect/>
                     </a:stretch>
@@ -11641,18 +11564,18 @@
           <wp:inline>
             <wp:extent cx="5334000" cy="3259666"/>
             <wp:effectExtent b="0" l="0" r="0" t="0"/>
-            <wp:docPr descr="Figure 22. Decoded AndroidManifest.xml as shown by MobSF (evidence for Findings 1 and 4: provider at line 37, exported activities at lines 24–36, allowBackup=&quot;true&quot; at line 8)." title="" id="116" name="Picture"/>
+            <wp:docPr descr="Figure 22. Decoded AndroidManifest.xml as shown by MobSF (evidence for Findings 1 and 4: provider at line 37, exported activities at lines 24–36, allowBackup=&quot;true&quot; at line 8)." title="" id="115" name="Picture"/>
             <a:graphic>
               <a:graphicData uri="http://schemas.openxmlformats.org/drawingml/2006/picture">
                 <pic:pic>
                   <pic:nvPicPr>
-                    <pic:cNvPr descr="../Screenshots/22_stage4_manifest_xml_evidence.png" id="117" name="Picture"/>
+                    <pic:cNvPr descr="../Screenshots/22_stage4_manifest_xml_evidence.png" id="116" name="Picture"/>
                     <pic:cNvPicPr>
                       <a:picLocks noChangeArrowheads="1" noChangeAspect="1"/>
                     </pic:cNvPicPr>
                   </pic:nvPicPr>
                   <pic:blipFill>
-                    <a:blip r:embed="rId115"/>
+                    <a:blip r:embed="rId114"/>
                     <a:stretch>
                       <a:fillRect/>
                     </a:stretch>
@@ -11711,18 +11634,18 @@
           <wp:inline>
             <wp:extent cx="5334000" cy="3259666"/>
             <wp:effectExtent b="0" l="0" r="0" t="0"/>
-            <wp:docPr descr="Figure 23. MobSF source view of SQLInjectionActivity.java: plaintext credentials and card numbers (lines 23–26) and string-concatenated rawQuery (line 36) – Finding 2." title="" id="119" name="Picture"/>
+            <wp:docPr descr="Figure 23. MobSF source view of SQLInjectionActivity.java: plaintext credentials and card numbers (lines 23–26) and string-concatenated rawQuery (line 36) – Finding 2." title="" id="118" name="Picture"/>
             <a:graphic>
               <a:graphicData uri="http://schemas.openxmlformats.org/drawingml/2006/picture">
                 <pic:pic>
                   <pic:nvPicPr>
-                    <pic:cNvPr descr="../Screenshots/23_stage4_SQLInjectionActivity_source.png" id="120" name="Picture"/>
+                    <pic:cNvPr descr="../Screenshots/23_stage4_SQLInjectionActivity_source.png" id="119" name="Picture"/>
                     <pic:cNvPicPr>
                       <a:picLocks noChangeArrowheads="1" noChangeAspect="1"/>
                     </pic:cNvPicPr>
                   </pic:nvPicPr>
                   <pic:blipFill>
-                    <a:blip r:embed="rId118"/>
+                    <a:blip r:embed="rId117"/>
                     <a:stretch>
                       <a:fillRect/>
                     </a:stretch>
@@ -11793,18 +11716,18 @@
           <wp:inline>
             <wp:extent cx="5334000" cy="6249077"/>
             <wp:effectExtent b="0" l="0" r="0" t="0"/>
-            <wp:docPr descr="Figure 24. MobSF source view of NotesProvider.java: unrestricted query/insert/update/delete on private notes and SQL built from URI segments – Finding 1." title="" id="122" name="Picture"/>
+            <wp:docPr descr="Figure 24. MobSF source view of NotesProvider.java: unrestricted query/insert/update/delete on private notes and SQL built from URI segments – Finding 1." title="" id="121" name="Picture"/>
             <a:graphic>
               <a:graphicData uri="http://schemas.openxmlformats.org/drawingml/2006/picture">
                 <pic:pic>
                   <pic:nvPicPr>
-                    <pic:cNvPr descr="../Screenshots/24_stage4_NotesProvider_source.png" id="123" name="Picture"/>
+                    <pic:cNvPr descr="../Screenshots/24_stage4_NotesProvider_source.png" id="122" name="Picture"/>
                     <pic:cNvPicPr>
                       <a:picLocks noChangeArrowheads="1" noChangeAspect="1"/>
                     </pic:cNvPicPr>
                   </pic:nvPicPr>
                   <pic:blipFill>
-                    <a:blip r:embed="rId121"/>
+                    <a:blip r:embed="rId120"/>
                     <a:stretch>
                       <a:fillRect/>
                     </a:stretch>
@@ -11860,18 +11783,18 @@
           <wp:inline>
             <wp:extent cx="5334000" cy="3259666"/>
             <wp:effectExtent b="0" l="0" r="0" t="0"/>
-            <wp:docPr descr="Figure 25. MobSF source view of InsecureDataStorage4Activity.java: credentials written to /sdcard/.uinfo.txt – Finding 3." title="" id="125" name="Picture"/>
+            <wp:docPr descr="Figure 25. MobSF source view of InsecureDataStorage4Activity.java: credentials written to /sdcard/.uinfo.txt – Finding 3." title="" id="124" name="Picture"/>
             <a:graphic>
               <a:graphicData uri="http://schemas.openxmlformats.org/drawingml/2006/picture">
                 <pic:pic>
                   <pic:nvPicPr>
-                    <pic:cNvPr descr="../Screenshots/25_stage4_InsecureDataStorage4_source.png" id="126" name="Picture"/>
+                    <pic:cNvPr descr="../Screenshots/25_stage4_InsecureDataStorage4_source.png" id="125" name="Picture"/>
                     <pic:cNvPicPr>
                       <a:picLocks noChangeArrowheads="1" noChangeAspect="1"/>
                     </pic:cNvPicPr>
                   </pic:nvPicPr>
                   <pic:blipFill>
-                    <a:blip r:embed="rId124"/>
+                    <a:blip r:embed="rId123"/>
                     <a:stretch>
                       <a:fillRect/>
                     </a:stretch>
@@ -11942,18 +11865,18 @@
           <wp:inline>
             <wp:extent cx="5334000" cy="3259666"/>
             <wp:effectExtent b="0" l="0" r="0" t="0"/>
-            <wp:docPr descr="Figure 26. MobSF source view of LogActivity.java: credit card number written to logcat with Log.e – Finding 5." title="" id="128" name="Picture"/>
+            <wp:docPr descr="Figure 26. MobSF source view of LogActivity.java: credit card number written to logcat with Log.e – Finding 5." title="" id="127" name="Picture"/>
             <a:graphic>
               <a:graphicData uri="http://schemas.openxmlformats.org/drawingml/2006/picture">
                 <pic:pic>
                   <pic:nvPicPr>
-                    <pic:cNvPr descr="../Screenshots/26_stage4_LogActivity_source.png" id="129" name="Picture"/>
+                    <pic:cNvPr descr="../Screenshots/26_stage4_LogActivity_source.png" id="128" name="Picture"/>
                     <pic:cNvPicPr>
                       <a:picLocks noChangeArrowheads="1" noChangeAspect="1"/>
                     </pic:cNvPicPr>
                   </pic:nvPicPr>
                   <pic:blipFill>
-                    <a:blip r:embed="rId127"/>
+                    <a:blip r:embed="rId126"/>
                     <a:stretch>
                       <a:fillRect/>
                     </a:stretch>
@@ -12024,18 +11947,18 @@
           <wp:inline>
             <wp:extent cx="5334000" cy="3259666"/>
             <wp:effectExtent b="0" l="0" r="0" t="0"/>
-            <wp:docPr descr="Figure 27. MobSF source view of HardcodeActivity.java: hardcoded key vendorsecretkey, which MobSF did not flag as a secret (false negative, Section 10.6)." title="" id="131" name="Picture"/>
+            <wp:docPr descr="Figure 27. MobSF source view of HardcodeActivity.java: hardcoded key vendorsecretkey, which MobSF did not flag as a secret (false negative, Section 10.6)." title="" id="130" name="Picture"/>
             <a:graphic>
               <a:graphicData uri="http://schemas.openxmlformats.org/drawingml/2006/picture">
                 <pic:pic>
                   <pic:nvPicPr>
-                    <pic:cNvPr descr="../Screenshots/27_stage4_HardcodeActivity_source_false_negative.png" id="132" name="Picture"/>
+                    <pic:cNvPr descr="../Screenshots/27_stage4_HardcodeActivity_source_false_negative.png" id="131" name="Picture"/>
                     <pic:cNvPicPr>
                       <a:picLocks noChangeArrowheads="1" noChangeAspect="1"/>
                     </pic:cNvPicPr>
                   </pic:nvPicPr>
                   <pic:blipFill>
-                    <a:blip r:embed="rId130"/>
+                    <a:blip r:embed="rId129"/>
                     <a:stretch>
                       <a:fillRect/>
                     </a:stretch>
@@ -12103,18 +12026,18 @@
           <wp:inline>
             <wp:extent cx="5334000" cy="4074583"/>
             <wp:effectExtent b="0" l="0" r="0" t="0"/>
-            <wp:docPr descr="Figure 28. Android API usage detected by MobSF (IPC, local file I/O, native code, content provider, start activity)." title="" id="134" name="Picture"/>
+            <wp:docPr descr="Figure 28. Android API usage detected by MobSF (IPC, local file I/O, native code, content provider, start activity)." title="" id="133" name="Picture"/>
             <a:graphic>
               <a:graphicData uri="http://schemas.openxmlformats.org/drawingml/2006/picture">
                 <pic:pic>
                   <pic:nvPicPr>
-                    <pic:cNvPr descr="../Screenshots/19_stage3_android_api.png" id="135" name="Picture"/>
+                    <pic:cNvPr descr="../Screenshots/19_stage3_android_api.png" id="134" name="Picture"/>
                     <pic:cNvPicPr>
                       <a:picLocks noChangeArrowheads="1" noChangeAspect="1"/>
                     </pic:cNvPicPr>
                   </pic:nvPicPr>
                   <pic:blipFill>
-                    <a:blip r:embed="rId133"/>
+                    <a:blip r:embed="rId132"/>
                     <a:stretch>
                       <a:fillRect/>
                     </a:stretch>
@@ -12158,18 +12081,18 @@
           <wp:inline>
             <wp:extent cx="5334000" cy="4074583"/>
             <wp:effectExtent b="0" l="0" r="0" t="0"/>
-            <wp:docPr descr="Figure 29. Components section of the MobSF report (activities and providers)." title="" id="137" name="Picture"/>
+            <wp:docPr descr="Figure 29. Components section of the MobSF report (activities and providers)." title="" id="136" name="Picture"/>
             <a:graphic>
               <a:graphicData uri="http://schemas.openxmlformats.org/drawingml/2006/picture">
                 <pic:pic>
                   <pic:nvPicPr>
-                    <pic:cNvPr descr="../Screenshots/21_stage3_components.png" id="138" name="Picture"/>
+                    <pic:cNvPr descr="../Screenshots/21_stage3_components.png" id="137" name="Picture"/>
                     <pic:cNvPicPr>
                       <a:picLocks noChangeArrowheads="1" noChangeAspect="1"/>
                     </pic:cNvPicPr>
                   </pic:nvPicPr>
                   <pic:blipFill>
-                    <a:blip r:embed="rId136"/>
+                    <a:blip r:embed="rId135"/>
                     <a:stretch>
                       <a:fillRect/>
                     </a:stretch>
@@ -12222,7 +12145,7 @@
         <w:t xml:space="preserve">the APK, MobSF’s own 25-page PDF export, the JSON report, build logs and full-resolution screenshots are kept by the student and can be provided on request or shown during the demonstration.</w:t>
       </w:r>
     </w:p>
-    <w:bookmarkEnd w:id="139"/>
+    <w:bookmarkEnd w:id="138"/>
     <w:sectPr>
       <w:pgSz w:w="11906" w:h="16838"/>
       <w:pgMar w:left="1020" w:right="1020"/>

</xml_diff>

<commit_message>
Report: drop Android Studio placeholders, state equivalent build action, renumber figures 1-27
Co-Authored-By: Claude Opus 5.5 <noreply@anthropic.com>
Claude-Session: https://claude.ai/code/session_013jcZrhQuTopEdkJ4pmS4yQ
</commit_message>
<xml_diff>
--- a/CSE410_Lab_DIVA_MobSF/Report/CSE410_DIVA_MobSF_Lab_Report.docx
+++ b/CSE410_Lab_DIVA_MobSF/Report/CSE410_DIVA_MobSF_Lab_Report.docx
@@ -1597,25 +1597,60 @@
             </w:pPr>
             <w:r>
               <w:rPr>
-                <w:rStyle w:val="VerbatimChar"/>
-                <w:sz w:val="17"/>
-              </w:rPr>
-              <w:t xml:space="preserve">[record your installed version, e.g. Help → About]</w:t>
-            </w:r>
-          </w:p>
-        </w:tc>
-        <w:tc>
-          <w:tcPr/>
-          <w:p>
-            <w:pPr>
-              <w:pStyle w:val="Compact"/>
-              <w:jc w:val="left"/>
-            </w:pPr>
-            <w:r>
-              <w:rPr>
-                <w:sz w:val="17"/>
-              </w:rPr>
-              <w:t xml:space="preserve">IDE used to open/sync/build the project (see 6.2)</w:t>
+                <w:sz w:val="17"/>
+              </w:rPr>
+              <w:t xml:space="preserve">Not installed on the assessment host. Step 1.4’s</w:t>
+            </w:r>
+            <w:r>
+              <w:rPr>
+                <w:sz w:val="17"/>
+              </w:rPr>
+              <w:t xml:space="preserve"> </w:t>
+            </w:r>
+            <w:r>
+              <w:rPr>
+                <w:sz w:val="17"/>
+              </w:rPr>
+              <w:t xml:space="preserve">“</w:t>
+            </w:r>
+            <w:r>
+              <w:rPr>
+                <w:sz w:val="17"/>
+              </w:rPr>
+              <w:t xml:space="preserve">equivalent build action</w:t>
+            </w:r>
+            <w:r>
+              <w:rPr>
+                <w:sz w:val="17"/>
+              </w:rPr>
+              <w:t xml:space="preserve">”</w:t>
+            </w:r>
+            <w:r>
+              <w:rPr>
+                <w:sz w:val="17"/>
+              </w:rPr>
+              <w:t xml:space="preserve"> </w:t>
+            </w:r>
+            <w:r>
+              <w:rPr>
+                <w:sz w:val="17"/>
+              </w:rPr>
+              <w:t xml:space="preserve">was used (Section 6.4); an Android-Studio-ready project is provided</w:t>
+            </w:r>
+          </w:p>
+        </w:tc>
+        <w:tc>
+          <w:tcPr/>
+          <w:p>
+            <w:pPr>
+              <w:pStyle w:val="Compact"/>
+              <w:jc w:val="left"/>
+            </w:pPr>
+            <w:r>
+              <w:rPr>
+                <w:sz w:val="17"/>
+              </w:rPr>
+              <w:t xml:space="preserve">IDE route documented in 6.2</w:t>
             </w:r>
           </w:p>
         </w:tc>
@@ -2589,7 +2624,7 @@
           <w:bCs/>
           <w:b/>
         </w:rPr>
-        <w:t xml:space="preserve">Procedure:</w:t>
+        <w:t xml:space="preserve">Procedure (Android Studio route):</w:t>
       </w:r>
       <w:r>
         <w:t xml:space="preserve"> </w:t>
@@ -3036,52 +3071,6 @@
         <w:t xml:space="preserve">resource compiler rejects as an error.</w:t>
       </w:r>
     </w:p>
-    <w:p>
-      <w:pPr>
-        <w:pStyle w:val="BlockText"/>
-      </w:pPr>
-      <w:r>
-        <w:rPr>
-          <w:bCs/>
-          <w:b/>
-        </w:rPr>
-        <w:t xml:space="preserve">Figure 2 — screenshot to insert.</w:t>
-      </w:r>
-      <w:r>
-        <w:t xml:space="preserve"> </w:t>
-      </w:r>
-      <w:r>
-        <w:t xml:space="preserve">DIVA project opened in Android Studio (Project view showing</w:t>
-      </w:r>
-      <w:r>
-        <w:t xml:space="preserve"> </w:t>
-      </w:r>
-      <w:r>
-        <w:rPr>
-          <w:rStyle w:val="VerbatimChar"/>
-        </w:rPr>
-        <w:t xml:space="preserve">app/src/main/java/jakhar/aseem/diva</w:t>
-      </w:r>
-      <w:r>
-        <w:t xml:space="preserve">, Gradle sync finished). Record the Android Studio version from</w:t>
-      </w:r>
-      <w:r>
-        <w:t xml:space="preserve"> </w:t>
-      </w:r>
-      <w:r>
-        <w:rPr>
-          <w:iCs/>
-          <w:i/>
-        </w:rPr>
-        <w:t xml:space="preserve">Help → About</w:t>
-      </w:r>
-      <w:r>
-        <w:t xml:space="preserve"> </w:t>
-      </w:r>
-      <w:r>
-        <w:t xml:space="preserve">in Section 5.</w:t>
-      </w:r>
-    </w:p>
     <w:bookmarkEnd w:id="38"/>
     <w:bookmarkStart w:id="42" w:name="step-1.3-preparing-the-native-component"/>
     <w:p>
@@ -3271,7 +3260,7 @@
           <wp:inline>
             <wp:extent cx="5334000" cy="2327812"/>
             <wp:effectExtent b="0" l="0" r="0" t="0"/>
-            <wp:docPr descr="Figure 3. make in app/src/main/jni compiled libdivajni.so for armeabi-v7a, arm64-v8a, x86, x86_64 and riscv64 and copied the libraries into jniLibs/." title="" id="40" name="Picture"/>
+            <wp:docPr descr="Figure 2. make in app/src/main/jni compiled libdivajni.so for armeabi-v7a, arm64-v8a, x86, x86_64 and riscv64 and copied the libraries into jniLibs/." title="" id="40" name="Picture"/>
             <a:graphic>
               <a:graphicData uri="http://schemas.openxmlformats.org/drawingml/2006/picture">
                 <pic:pic>
@@ -3314,7 +3303,7 @@
         <w:pStyle w:val="ImageCaption"/>
       </w:pPr>
       <w:r>
-        <w:t xml:space="preserve">Figure 3.</w:t>
+        <w:t xml:space="preserve">Figure 2.</w:t>
       </w:r>
       <w:r>
         <w:t xml:space="preserve"> </w:t>
@@ -3649,7 +3638,7 @@
           <wp:inline>
             <wp:extent cx="5334000" cy="1641230"/>
             <wp:effectExtent b="0" l="0" r="0" t="0"/>
-            <wp:docPr descr="Figure 4. Successful build of the DIVA debug APK (BUILD SUCCESSFUL). It shows the seven build stages, the debug-signing certificate and the SHA-256 of the output." title="" id="44" name="Picture"/>
+            <wp:docPr descr="Figure 3. Successful build of the DIVA debug APK (BUILD SUCCESSFUL). It shows the seven build stages, the debug-signing certificate and the SHA-256 of the output." title="" id="44" name="Picture"/>
             <a:graphic>
               <a:graphicData uri="http://schemas.openxmlformats.org/drawingml/2006/picture">
                 <pic:pic>
@@ -3692,7 +3681,7 @@
         <w:pStyle w:val="ImageCaption"/>
       </w:pPr>
       <w:r>
-        <w:t xml:space="preserve">Figure 4. Successful build of the DIVA debug APK (</w:t>
+        <w:t xml:space="preserve">Figure 3. Successful build of the DIVA debug APK (</w:t>
       </w:r>
       <w:r>
         <w:rPr>
@@ -3702,109 +3691,6 @@
       </w:r>
       <w:r>
         <w:t xml:space="preserve">). It shows the seven build stages, the debug-signing certificate and the SHA-256 of the output.</w:t>
-      </w:r>
-    </w:p>
-    <w:p>
-      <w:pPr>
-        <w:pStyle w:val="BlockText"/>
-      </w:pPr>
-      <w:r>
-        <w:rPr>
-          <w:bCs/>
-          <w:b/>
-        </w:rPr>
-        <w:t xml:space="preserve">Figure 5 — screenshot to insert.</w:t>
-      </w:r>
-      <w:r>
-        <w:t xml:space="preserve"> </w:t>
-      </w:r>
-      <w:r>
-        <w:t xml:space="preserve">Android Studio</w:t>
-      </w:r>
-      <w:r>
-        <w:t xml:space="preserve"> </w:t>
-      </w:r>
-      <w:r>
-        <w:rPr>
-          <w:iCs/>
-          <w:i/>
-        </w:rPr>
-        <w:t xml:space="preserve">Build</w:t>
-      </w:r>
-      <w:r>
-        <w:t xml:space="preserve"> </w:t>
-      </w:r>
-      <w:r>
-        <w:t xml:space="preserve">window showing</w:t>
-      </w:r>
-      <w:r>
-        <w:t xml:space="preserve"> </w:t>
-      </w:r>
-      <w:r>
-        <w:rPr>
-          <w:rStyle w:val="VerbatimChar"/>
-        </w:rPr>
-        <w:t xml:space="preserve">BUILD SUCCESSFUL</w:t>
-      </w:r>
-      <w:r>
-        <w:t xml:space="preserve"> </w:t>
-      </w:r>
-      <w:r>
-        <w:t xml:space="preserve">after</w:t>
-      </w:r>
-      <w:r>
-        <w:t xml:space="preserve"> </w:t>
-      </w:r>
-      <w:r>
-        <w:rPr>
-          <w:iCs/>
-          <w:i/>
-        </w:rPr>
-        <w:t xml:space="preserve">Build → Make Project</w:t>
-      </w:r>
-      <w:r>
-        <w:t xml:space="preserve">, and the</w:t>
-      </w:r>
-      <w:r>
-        <w:t xml:space="preserve"> </w:t>
-      </w:r>
-      <w:r>
-        <w:rPr>
-          <w:iCs/>
-          <w:i/>
-        </w:rPr>
-        <w:t xml:space="preserve">Project</w:t>
-      </w:r>
-      <w:r>
-        <w:t xml:space="preserve"> </w:t>
-      </w:r>
-      <w:r>
-        <w:t xml:space="preserve">view (or</w:t>
-      </w:r>
-      <w:r>
-        <w:t xml:space="preserve"> </w:t>
-      </w:r>
-      <w:r>
-        <w:rPr>
-          <w:iCs/>
-          <w:i/>
-        </w:rPr>
-        <w:t xml:space="preserve">Build → Build APK(s) → locate</w:t>
-      </w:r>
-      <w:r>
-        <w:t xml:space="preserve">) showing</w:t>
-      </w:r>
-      <w:r>
-        <w:t xml:space="preserve"> </w:t>
-      </w:r>
-      <w:r>
-        <w:rPr>
-          <w:rStyle w:val="VerbatimChar"/>
-        </w:rPr>
-        <w:t xml:space="preserve">app/build/outputs/apk/debug/app-debug.apk</w:t>
-      </w:r>
-      <w:r>
-        <w:t xml:space="preserve">.</w:t>
       </w:r>
     </w:p>
     <w:bookmarkEnd w:id="46"/>
@@ -4243,22 +4129,22 @@
               <w:rPr>
                 <w:sz w:val="17"/>
               </w:rPr>
-              <w:t xml:space="preserve">Build OS / Android Studio</w:t>
-            </w:r>
-          </w:p>
-        </w:tc>
-        <w:tc>
-          <w:tcPr/>
-          <w:p>
-            <w:pPr>
-              <w:pStyle w:val="Compact"/>
-              <w:jc w:val="left"/>
-            </w:pPr>
-            <w:r>
-              <w:rPr>
-                <w:sz w:val="17"/>
-              </w:rPr>
-              <w:t xml:space="preserve">Ubuntu 24.04.5 LTS /</w:t>
+              <w:t xml:space="preserve">Build OS / build tool</w:t>
+            </w:r>
+          </w:p>
+        </w:tc>
+        <w:tc>
+          <w:tcPr/>
+          <w:p>
+            <w:pPr>
+              <w:pStyle w:val="Compact"/>
+              <w:jc w:val="left"/>
+            </w:pPr>
+            <w:r>
+              <w:rPr>
+                <w:sz w:val="17"/>
+              </w:rPr>
+              <w:t xml:space="preserve">Ubuntu 24.04.5 LTS / Android SDK build-tools 35.0.0 (command-line equivalent of</w:t>
             </w:r>
             <w:r>
               <w:rPr>
@@ -4268,10 +4154,17 @@
             </w:r>
             <w:r>
               <w:rPr>
-                <w:rStyle w:val="VerbatimChar"/>
-                <w:sz w:val="17"/>
-              </w:rPr>
-              <w:t xml:space="preserve">[your Android Studio version]</w:t>
+                <w:iCs/>
+                <w:i/>
+                <w:sz w:val="17"/>
+              </w:rPr>
+              <w:t xml:space="preserve">Build → Make Project</w:t>
+            </w:r>
+            <w:r>
+              <w:rPr>
+                <w:sz w:val="17"/>
+              </w:rPr>
+              <w:t xml:space="preserve">)</w:t>
             </w:r>
           </w:p>
         </w:tc>
@@ -4286,7 +4179,7 @@
           <wp:inline>
             <wp:extent cx="5334000" cy="1879209"/>
             <wp:effectExtent b="0" l="0" r="0" t="0"/>
-            <wp:docPr descr="Figure 6. Generated APK checked with aapt2 dump badging: package jakhar.aseem.diva, SDK levels, permissions, classes.dex, resources.arsc and the bundled native libraries." title="" id="48" name="Picture"/>
+            <wp:docPr descr="Figure 4. Generated APK checked with aapt2 dump badging: package jakhar.aseem.diva, SDK levels, permissions, classes.dex, resources.arsc and the bundled native libraries." title="" id="48" name="Picture"/>
             <a:graphic>
               <a:graphicData uri="http://schemas.openxmlformats.org/drawingml/2006/picture">
                 <pic:pic>
@@ -4329,7 +4222,7 @@
         <w:pStyle w:val="ImageCaption"/>
       </w:pPr>
       <w:r>
-        <w:t xml:space="preserve">Figure 6. Generated APK checked with</w:t>
+        <w:t xml:space="preserve">Figure 4. Generated APK checked with</w:t>
       </w:r>
       <w:r>
         <w:t xml:space="preserve"> </w:t>
@@ -4488,7 +4381,7 @@
           <wp:inline>
             <wp:extent cx="5334000" cy="1641230"/>
             <wp:effectExtent b="0" l="0" r="0" t="0"/>
-            <wp:docPr descr="Figure 7. Official MobSF image pulled from Docker Hub (Status: Downloaded newer image …)." title="" id="53" name="Picture"/>
+            <wp:docPr descr="Figure 5. Official MobSF image pulled from Docker Hub (Status: Downloaded newer image …)." title="" id="53" name="Picture"/>
             <a:graphic>
               <a:graphicData uri="http://schemas.openxmlformats.org/drawingml/2006/picture">
                 <pic:pic>
@@ -4531,7 +4424,7 @@
         <w:pStyle w:val="ImageCaption"/>
       </w:pPr>
       <w:r>
-        <w:t xml:space="preserve">Figure 7. Official MobSF image pulled from Docker Hub (</w:t>
+        <w:t xml:space="preserve">Figure 5. Official MobSF image pulled from Docker Hub (</w:t>
       </w:r>
       <w:r>
         <w:rPr>
@@ -4594,7 +4487,7 @@
           <wp:inline>
             <wp:extent cx="5334000" cy="2026920"/>
             <wp:effectExtent b="0" l="0" r="0" t="0"/>
-            <wp:docPr descr="Figure 8. MobSF container start-up log: MobSF v4.6.2 banner, default credentials mobsf/mobsf, and the container listening on 0.0.0.0:8000. The REST API key is redacted." title="" id="56" name="Picture"/>
+            <wp:docPr descr="Figure 6. MobSF container start-up log: MobSF v4.6.2 banner, default credentials mobsf/mobsf, and the container listening on 0.0.0.0:8000. The REST API key is redacted." title="" id="56" name="Picture"/>
             <a:graphic>
               <a:graphicData uri="http://schemas.openxmlformats.org/drawingml/2006/picture">
                 <pic:pic>
@@ -4637,7 +4530,7 @@
         <w:pStyle w:val="ImageCaption"/>
       </w:pPr>
       <w:r>
-        <w:t xml:space="preserve">Figure 8. MobSF container start-up log: MobSF v4.6.2 banner, default credentials</w:t>
+        <w:t xml:space="preserve">Figure 6. MobSF container start-up log: MobSF v4.6.2 banner, default credentials</w:t>
       </w:r>
       <w:r>
         <w:t xml:space="preserve"> </w:t>
@@ -4716,7 +4609,7 @@
           <wp:inline>
             <wp:extent cx="5334000" cy="3333750"/>
             <wp:effectExtent b="0" l="0" r="0" t="0"/>
-            <wp:docPr descr="Figure 9. MobSF login page at http://127.0.0.1:8000 (version 4.6.2 shown in the footer)." title="" id="59" name="Picture"/>
+            <wp:docPr descr="Figure 7. MobSF login page at http://127.0.0.1:8000 (version 4.6.2 shown in the footer)." title="" id="59" name="Picture"/>
             <a:graphic>
               <a:graphicData uri="http://schemas.openxmlformats.org/drawingml/2006/picture">
                 <pic:pic>
@@ -4759,7 +4652,7 @@
         <w:pStyle w:val="ImageCaption"/>
       </w:pPr>
       <w:r>
-        <w:t xml:space="preserve">Figure 9. MobSF login page at http://127.0.0.1:8000 (version 4.6.2 shown in the footer).</w:t>
+        <w:t xml:space="preserve">Figure 7. MobSF login page at http://127.0.0.1:8000 (version 4.6.2 shown in the footer).</w:t>
       </w:r>
     </w:p>
     <w:p>
@@ -4811,7 +4704,7 @@
           <wp:inline>
             <wp:extent cx="5334000" cy="3333750"/>
             <wp:effectExtent b="0" l="0" r="0" t="0"/>
-            <wp:docPr descr="Figure 10. MobSF dashboard after login, ready for upload. The footer confirms “Mobile Security Framework – MobSF v4.6.2”." title="" id="62" name="Picture"/>
+            <wp:docPr descr="Figure 8. MobSF dashboard after login, ready for upload. The footer confirms “Mobile Security Framework – MobSF v4.6.2”." title="" id="62" name="Picture"/>
             <a:graphic>
               <a:graphicData uri="http://schemas.openxmlformats.org/drawingml/2006/picture">
                 <pic:pic>
@@ -4854,7 +4747,7 @@
         <w:pStyle w:val="ImageCaption"/>
       </w:pPr>
       <w:r>
-        <w:t xml:space="preserve">Figure 10. MobSF dashboard after login, ready for upload. The footer confirms</w:t>
+        <w:t xml:space="preserve">Figure 8. MobSF dashboard after login, ready for upload. The footer confirms</w:t>
       </w:r>
       <w:r>
         <w:t xml:space="preserve"> </w:t>
@@ -5092,7 +4985,7 @@
         <w:t xml:space="preserve"> </w:t>
       </w:r>
       <w:r>
-        <w:t xml:space="preserve">every section of the static-analysis report was reviewed (Figures 13–21).</w:t>
+        <w:t xml:space="preserve">every section of the static-analysis report was reviewed (Figures 9–19).</w:t>
       </w:r>
     </w:p>
     <w:p>
@@ -5251,7 +5144,7 @@
           <wp:inline>
             <wp:extent cx="5334000" cy="3333750"/>
             <wp:effectExtent b="0" l="0" r="0" t="0"/>
-            <wp:docPr descr="Figure 11. DIVA APK uploaded through the MobSF web interface; the static analysis is running." title="" id="66" name="Picture"/>
+            <wp:docPr descr="Figure 9. DIVA APK uploaded through the MobSF web interface; the static analysis is running." title="" id="66" name="Picture"/>
             <a:graphic>
               <a:graphicData uri="http://schemas.openxmlformats.org/drawingml/2006/picture">
                 <pic:pic>
@@ -5294,7 +5187,7 @@
         <w:pStyle w:val="ImageCaption"/>
       </w:pPr>
       <w:r>
-        <w:t xml:space="preserve">Figure 11. DIVA APK uploaded through the MobSF web interface; the static analysis is running.</w:t>
+        <w:t xml:space="preserve">Figure 9. DIVA APK uploaded through the MobSF web interface; the static analysis is running.</w:t>
       </w:r>
     </w:p>
     <w:p>
@@ -5306,7 +5199,7 @@
           <wp:inline>
             <wp:extent cx="5334000" cy="5150729"/>
             <wp:effectExtent b="0" l="0" r="0" t="0"/>
-            <wp:docPr descr="Figure 12. MobSF analysis log for the scan. It shows each automated step, including successful JADX decompilation and SAST." title="" id="69" name="Picture"/>
+            <wp:docPr descr="Figure 10. MobSF analysis log for the scan. It shows each automated step, including successful JADX decompilation and SAST." title="" id="69" name="Picture"/>
             <a:graphic>
               <a:graphicData uri="http://schemas.openxmlformats.org/drawingml/2006/picture">
                 <pic:pic>
@@ -5349,7 +5242,7 @@
         <w:pStyle w:val="ImageCaption"/>
       </w:pPr>
       <w:r>
-        <w:t xml:space="preserve">Figure 12. MobSF analysis log for the scan. It shows each automated step, including successful JADX decompilation and SAST.</w:t>
+        <w:t xml:space="preserve">Figure 10. MobSF analysis log for the scan. It shows each automated step, including successful JADX decompilation and SAST.</w:t>
       </w:r>
     </w:p>
     <w:p>
@@ -5361,7 +5254,7 @@
           <wp:inline>
             <wp:extent cx="5334000" cy="3333750"/>
             <wp:effectExtent b="0" l="0" r="0" t="0"/>
-            <wp:docPr descr="Figure 13. MobSF result page for the student-built DIVA APK. It shows the security score of 47/100, file hashes, application information (Diva, jakhar.aseem.diva, Target SDK 23, Min SDK 15), 2/17 exported activities, 1/1 exported provider and the signer certificate." title="" id="72" name="Picture"/>
+            <wp:docPr descr="Figure 11. MobSF result page for the student-built DIVA APK. It shows the security score of 47/100, file hashes, application information (Diva, jakhar.aseem.diva, Target SDK 23, Min SDK 15), 2/17 exported activities, 1/1 exported provider and the signer certificate." title="" id="72" name="Picture"/>
             <a:graphic>
               <a:graphicData uri="http://schemas.openxmlformats.org/drawingml/2006/picture">
                 <pic:pic>
@@ -5404,7 +5297,7 @@
         <w:pStyle w:val="ImageCaption"/>
       </w:pPr>
       <w:r>
-        <w:t xml:space="preserve">Figure 13. MobSF result page for the student-built DIVA APK. It shows the security score of 47/100, file hashes, application information (Diva, jakhar.aseem.diva, Target SDK 23, Min SDK 15), 2/17 exported activities, 1/1 exported provider and the signer certificate.</w:t>
+        <w:t xml:space="preserve">Figure 11. MobSF result page for the student-built DIVA APK. It shows the security score of 47/100, file hashes, application information (Diva, jakhar.aseem.diva, Target SDK 23, Min SDK 15), 2/17 exported activities, 1/1 exported provider and the signer certificate.</w:t>
       </w:r>
     </w:p>
     <w:p>
@@ -5416,7 +5309,7 @@
           <wp:inline>
             <wp:extent cx="5334000" cy="4179873"/>
             <wp:effectExtent b="0" l="0" r="0" t="0"/>
-            <wp:docPr descr="Figure 14. MobSF Application Security Scorecard: score 47, Grade B, “Medium Risk”, and High 2 / Medium 8 / Info 1 / Secure 1 / Hotspot 1, with each finding and its source section." title="" id="75" name="Picture"/>
+            <wp:docPr descr="Figure 12. MobSF Application Security Scorecard: score 47, Grade B, “Medium Risk”, and High 2 / Medium 8 / Info 1 / Secure 1 / Hotspot 1, with each finding and its source section." title="" id="75" name="Picture"/>
             <a:graphic>
               <a:graphicData uri="http://schemas.openxmlformats.org/drawingml/2006/picture">
                 <pic:pic>
@@ -5459,7 +5352,7 @@
         <w:pStyle w:val="ImageCaption"/>
       </w:pPr>
       <w:r>
-        <w:t xml:space="preserve">Figure 14. MobSF Application Security Scorecard: score 47, Grade B,</w:t>
+        <w:t xml:space="preserve">Figure 12. MobSF Application Security Scorecard: score 47, Grade B,</w:t>
       </w:r>
       <w:r>
         <w:t xml:space="preserve"> </w:t>
@@ -5486,7 +5379,7 @@
           <wp:inline>
             <wp:extent cx="5334000" cy="4074583"/>
             <wp:effectExtent b="0" l="0" r="0" t="0"/>
-            <wp:docPr descr="Figure 15. Certificate analysis: the APK is signed with a debug certificate (high) and has a v1 signature, so MobSF flags Janus (warning)." title="" id="78" name="Picture"/>
+            <wp:docPr descr="Figure 13. Certificate analysis: the APK is signed with a debug certificate (high) and has a v1 signature, so MobSF flags Janus (warning)." title="" id="78" name="Picture"/>
             <a:graphic>
               <a:graphicData uri="http://schemas.openxmlformats.org/drawingml/2006/picture">
                 <pic:pic>
@@ -5529,7 +5422,7 @@
         <w:pStyle w:val="ImageCaption"/>
       </w:pPr>
       <w:r>
-        <w:t xml:space="preserve">Figure 15. Certificate analysis: the APK is signed with a debug certificate (high) and has a v1 signature, so MobSF flags Janus (warning).</w:t>
+        <w:t xml:space="preserve">Figure 13. Certificate analysis: the APK is signed with a debug certificate (high) and has a v1 signature, so MobSF flags Janus (warning).</w:t>
       </w:r>
     </w:p>
     <w:p>
@@ -5541,7 +5434,7 @@
           <wp:inline>
             <wp:extent cx="5334000" cy="4074583"/>
             <wp:effectExtent b="0" l="0" r="0" t="0"/>
-            <wp:docPr descr="Figure 16. Permissions: WRITE_EXTERNAL_STORAGE and READ_EXTERNAL_STORAGE (dangerous) and INTERNET (normal)." title="" id="81" name="Picture"/>
+            <wp:docPr descr="Figure 14. Permissions: WRITE_EXTERNAL_STORAGE and READ_EXTERNAL_STORAGE (dangerous) and INTERNET (normal)." title="" id="81" name="Picture"/>
             <a:graphic>
               <a:graphicData uri="http://schemas.openxmlformats.org/drawingml/2006/picture">
                 <pic:pic>
@@ -5584,7 +5477,7 @@
         <w:pStyle w:val="ImageCaption"/>
       </w:pPr>
       <w:r>
-        <w:t xml:space="preserve">Figure 16. Permissions: WRITE_EXTERNAL_STORAGE and READ_EXTERNAL_STORAGE (dangerous) and INTERNET (normal).</w:t>
+        <w:t xml:space="preserve">Figure 14. Permissions: WRITE_EXTERNAL_STORAGE and READ_EXTERNAL_STORAGE (dangerous) and INTERNET (normal).</w:t>
       </w:r>
     </w:p>
     <w:p>
@@ -5596,7 +5489,7 @@
           <wp:inline>
             <wp:extent cx="5334000" cy="4074583"/>
             <wp:effectExtent b="0" l="0" r="0" t="0"/>
-            <wp:docPr descr="Figure 17. Manifest analysis: minSdk 15 (high); allowBackup=true; exported .APICredsActivity and .APICreds2Activity with intent filters; exported, unprotected .NotesProvider (warning)." title="" id="84" name="Picture"/>
+            <wp:docPr descr="Figure 15. Manifest analysis: minSdk 15 (high); allowBackup=true; exported .APICredsActivity and .APICreds2Activity with intent filters; exported, unprotected .NotesProvider (warning)." title="" id="84" name="Picture"/>
             <a:graphic>
               <a:graphicData uri="http://schemas.openxmlformats.org/drawingml/2006/picture">
                 <pic:pic>
@@ -5639,7 +5532,7 @@
         <w:pStyle w:val="ImageCaption"/>
       </w:pPr>
       <w:r>
-        <w:t xml:space="preserve">Figure 17. Manifest analysis: minSdk 15 (high); allowBackup=true; exported</w:t>
+        <w:t xml:space="preserve">Figure 15. Manifest analysis: minSdk 15 (high); allowBackup=true; exported</w:t>
       </w:r>
       <w:r>
         <w:t xml:space="preserve"> </w:t>
@@ -5696,7 +5589,7 @@
           <wp:inline>
             <wp:extent cx="5334000" cy="4074583"/>
             <wp:effectExtent b="0" l="0" r="0" t="0"/>
-            <wp:docPr descr="Figure 18. Code analysis (SAST): logging of sensitive information (CWE-532), raw SQL queries (CWE-89), temp-file creation and external-storage read/write (CWE-276), with the affected DIVA classes." title="" id="87" name="Picture"/>
+            <wp:docPr descr="Figure 16. Code analysis (SAST): logging of sensitive information (CWE-532), raw SQL queries (CWE-89), temp-file creation and external-storage read/write (CWE-276), with the affected DIVA classes." title="" id="87" name="Picture"/>
             <a:graphic>
               <a:graphicData uri="http://schemas.openxmlformats.org/drawingml/2006/picture">
                 <pic:pic>
@@ -5739,7 +5632,7 @@
         <w:pStyle w:val="ImageCaption"/>
       </w:pPr>
       <w:r>
-        <w:t xml:space="preserve">Figure 18. Code analysis (SAST): logging of sensitive information (CWE-532), raw SQL queries (CWE-89), temp-file creation and external-storage read/write (CWE-276), with the affected DIVA classes.</w:t>
+        <w:t xml:space="preserve">Figure 16. Code analysis (SAST): logging of sensitive information (CWE-532), raw SQL queries (CWE-89), temp-file creation and external-storage read/write (CWE-276), with the affected DIVA classes.</w:t>
       </w:r>
     </w:p>
     <w:p>
@@ -5751,7 +5644,7 @@
           <wp:inline>
             <wp:extent cx="5334000" cy="4074583"/>
             <wp:effectExtent b="0" l="0" r="0" t="0"/>
-            <wp:docPr descr="Figure 19. Shared-library binary analysis of libdivajni.so: NX, PIC and Full RELRO are present, but there is no stack canary (high), because Android.mk builds with -fno-stack-protector. FORTIFY replaced strcpy with __strcpy_chk." title="" id="90" name="Picture"/>
+            <wp:docPr descr="Figure 17. Shared-library binary analysis of libdivajni.so: NX, PIC and Full RELRO are present, but there is no stack canary (high), because Android.mk builds with -fno-stack-protector. FORTIFY replaced strcpy with __strcpy_chk." title="" id="90" name="Picture"/>
             <a:graphic>
               <a:graphicData uri="http://schemas.openxmlformats.org/drawingml/2006/picture">
                 <pic:pic>
@@ -5794,7 +5687,7 @@
         <w:pStyle w:val="ImageCaption"/>
       </w:pPr>
       <w:r>
-        <w:t xml:space="preserve">Figure 19. Shared-library binary analysis of</w:t>
+        <w:t xml:space="preserve">Figure 17. Shared-library binary analysis of</w:t>
       </w:r>
       <w:r>
         <w:t xml:space="preserve"> </w:t>
@@ -5870,7 +5763,7 @@
           <wp:inline>
             <wp:extent cx="5334000" cy="4074583"/>
             <wp:effectExtent b="0" l="0" r="0" t="0"/>
-            <wp:docPr descr="Figure 20. Possible hardcoded secrets (&quot;pkey&quot; : &quot;notespin&quot;) and strings extracted from the native libraries, including the native vendor key olsdfgad;lh and the code .dotdot." title="" id="93" name="Picture"/>
+            <wp:docPr descr="Figure 18. Possible hardcoded secrets (&quot;pkey&quot; : &quot;notespin&quot;) and strings extracted from the native libraries, including the native vendor key olsdfgad;lh and the code .dotdot." title="" id="93" name="Picture"/>
             <a:graphic>
               <a:graphicData uri="http://schemas.openxmlformats.org/drawingml/2006/picture">
                 <pic:pic>
@@ -5913,7 +5806,7 @@
         <w:pStyle w:val="ImageCaption"/>
       </w:pPr>
       <w:r>
-        <w:t xml:space="preserve">Figure 20. Possible hardcoded secrets (</w:t>
+        <w:t xml:space="preserve">Figure 18. Possible hardcoded secrets (</w:t>
       </w:r>
       <w:r>
         <w:rPr>
@@ -7716,7 +7609,7 @@
         <w:t xml:space="preserve"> </w:t>
       </w:r>
       <w:r>
-        <w:t xml:space="preserve">(Figure 22, line 37). The provider (Figure 24) exposes</w:t>
+        <w:t xml:space="preserve">(Figure 20, line 37). The provider (Figure 22) exposes</w:t>
       </w:r>
       <w:r>
         <w:t xml:space="preserve"> </w:t>
@@ -8070,7 +7963,7 @@
         <w:t xml:space="preserve">NotesProvider.java</w:t>
       </w:r>
       <w:r>
-        <w:t xml:space="preserve">. At line 36 (Figure 23) the user’s text is concatenated into the statement:</w:t>
+        <w:t xml:space="preserve">. At line 36 (Figure 21) the user’s text is concatenated into the statement:</w:t>
       </w:r>
       <w:r>
         <w:t xml:space="preserve"> </w:t>
@@ -8320,7 +8213,7 @@
         <w:t xml:space="preserve"> </w:t>
       </w:r>
       <w:r>
-        <w:t xml:space="preserve">line 26 (Figure 25) calls</w:t>
+        <w:t xml:space="preserve">line 26 (Figure 23) calls</w:t>
       </w:r>
       <w:r>
         <w:t xml:space="preserve"> </w:t>
@@ -8404,7 +8297,7 @@
         <w:t xml:space="preserve"> </w:t>
       </w:r>
       <w:r>
-        <w:t xml:space="preserve">(Figure 16, flagged as</w:t>
+        <w:t xml:space="preserve">(Figure 14, flagged as</w:t>
       </w:r>
       <w:r>
         <w:t xml:space="preserve"> </w:t>
@@ -8604,7 +8497,7 @@
         <w:t xml:space="preserve"> </w:t>
       </w:r>
       <w:r>
-        <w:t xml:space="preserve">in the manifest (Figure 22, lines 24–36) the activities declare intent filters for the custom actions</w:t>
+        <w:t xml:space="preserve">in the manifest (Figure 20, lines 24–36) the activities declare intent filters for the custom actions</w:t>
       </w:r>
       <w:r>
         <w:t xml:space="preserve"> </w:t>
@@ -8903,7 +8796,7 @@
         <w:t xml:space="preserve"> </w:t>
       </w:r>
       <w:r>
-        <w:t xml:space="preserve">decompiled line 24 (Figure 26):</w:t>
+        <w:t xml:space="preserve">decompiled line 24 (Figure 24):</w:t>
       </w:r>
       <w:r>
         <w:t xml:space="preserve"> </w:t>
@@ -9071,7 +8964,7 @@
         <w:t xml:space="preserve"> </w:t>
       </w:r>
       <w:r>
-        <w:t xml:space="preserve">(Figure 20). Manual review of</w:t>
+        <w:t xml:space="preserve">(Figure 18). Manual review of</w:t>
       </w:r>
       <w:r>
         <w:t xml:space="preserve"> </w:t>
@@ -9190,7 +9083,7 @@
         <w:t xml:space="preserve"> </w:t>
       </w:r>
       <w:r>
-        <w:t xml:space="preserve">(Figure 27).</w:t>
+        <w:t xml:space="preserve">(Figure 25).</w:t>
       </w:r>
       <w:r>
         <w:t xml:space="preserve"> </w:t>
@@ -9260,7 +9153,7 @@
         <w:t xml:space="preserve"> </w:t>
       </w:r>
       <w:r>
-        <w:t xml:space="preserve">list (Figure 20) and not under</w:t>
+        <w:t xml:space="preserve">list (Figure 18) and not under</w:t>
       </w:r>
       <w:r>
         <w:t xml:space="preserve"> </w:t>
@@ -10886,7 +10779,7 @@
         <w:t xml:space="preserve"> </w:t>
       </w:r>
       <w:r>
-        <w:t xml:space="preserve">The first scan silently produced no code findings because JADX was missing, although the report still rendered. This shows that the analyst must check the scan log (Figure 12) before trusting an empty section.</w:t>
+        <w:t xml:space="preserve">The first scan silently produced no code findings because JADX was missing, although the report still rendered. This shows that the analyst must check the scan log (Figure 10) before trusting an empty section.</w:t>
       </w:r>
     </w:p>
     <w:p>
@@ -11509,7 +11402,7 @@
           <wp:inline>
             <wp:extent cx="5334000" cy="4074583"/>
             <wp:effectExtent b="0" l="0" r="0" t="0"/>
-            <wp:docPr descr="Figure 21. Application information section of the MobSF report." title="" id="112" name="Picture"/>
+            <wp:docPr descr="Figure 19. Application information section of the MobSF report." title="" id="112" name="Picture"/>
             <a:graphic>
               <a:graphicData uri="http://schemas.openxmlformats.org/drawingml/2006/picture">
                 <pic:pic>
@@ -11552,7 +11445,7 @@
         <w:pStyle w:val="ImageCaption"/>
       </w:pPr>
       <w:r>
-        <w:t xml:space="preserve">Figure 21. Application information section of the MobSF report.</w:t>
+        <w:t xml:space="preserve">Figure 19. Application information section of the MobSF report.</w:t>
       </w:r>
     </w:p>
     <w:p>
@@ -11564,7 +11457,7 @@
           <wp:inline>
             <wp:extent cx="5334000" cy="3259666"/>
             <wp:effectExtent b="0" l="0" r="0" t="0"/>
-            <wp:docPr descr="Figure 22. Decoded AndroidManifest.xml as shown by MobSF (evidence for Findings 1 and 4: provider at line 37, exported activities at lines 24–36, allowBackup=&quot;true&quot; at line 8)." title="" id="115" name="Picture"/>
+            <wp:docPr descr="Figure 20. Decoded AndroidManifest.xml as shown by MobSF (evidence for Findings 1 and 4: provider at line 37, exported activities at lines 24–36, allowBackup=&quot;true&quot; at line 8)." title="" id="115" name="Picture"/>
             <a:graphic>
               <a:graphicData uri="http://schemas.openxmlformats.org/drawingml/2006/picture">
                 <pic:pic>
@@ -11607,7 +11500,7 @@
         <w:pStyle w:val="ImageCaption"/>
       </w:pPr>
       <w:r>
-        <w:t xml:space="preserve">Figure 22. Decoded AndroidManifest.xml as shown by MobSF (evidence for Findings 1 and 4: provider at line 37, exported activities at lines 24–36,</w:t>
+        <w:t xml:space="preserve">Figure 20. Decoded AndroidManifest.xml as shown by MobSF (evidence for Findings 1 and 4: provider at line 37, exported activities at lines 24–36,</w:t>
       </w:r>
       <w:r>
         <w:t xml:space="preserve"> </w:t>
@@ -11634,7 +11527,7 @@
           <wp:inline>
             <wp:extent cx="5334000" cy="3259666"/>
             <wp:effectExtent b="0" l="0" r="0" t="0"/>
-            <wp:docPr descr="Figure 23. MobSF source view of SQLInjectionActivity.java: plaintext credentials and card numbers (lines 23–26) and string-concatenated rawQuery (line 36) – Finding 2." title="" id="118" name="Picture"/>
+            <wp:docPr descr="Figure 21. MobSF source view of SQLInjectionActivity.java: plaintext credentials and card numbers (lines 23–26) and string-concatenated rawQuery (line 36) – Finding 2." title="" id="118" name="Picture"/>
             <a:graphic>
               <a:graphicData uri="http://schemas.openxmlformats.org/drawingml/2006/picture">
                 <pic:pic>
@@ -11677,7 +11570,7 @@
         <w:pStyle w:val="ImageCaption"/>
       </w:pPr>
       <w:r>
-        <w:t xml:space="preserve">Figure 23. MobSF source view of</w:t>
+        <w:t xml:space="preserve">Figure 21. MobSF source view of</w:t>
       </w:r>
       <w:r>
         <w:t xml:space="preserve"> </w:t>
@@ -11716,7 +11609,7 @@
           <wp:inline>
             <wp:extent cx="5334000" cy="6249077"/>
             <wp:effectExtent b="0" l="0" r="0" t="0"/>
-            <wp:docPr descr="Figure 24. MobSF source view of NotesProvider.java: unrestricted query/insert/update/delete on private notes and SQL built from URI segments – Finding 1." title="" id="121" name="Picture"/>
+            <wp:docPr descr="Figure 22. MobSF source view of NotesProvider.java: unrestricted query/insert/update/delete on private notes and SQL built from URI segments – Finding 1." title="" id="121" name="Picture"/>
             <a:graphic>
               <a:graphicData uri="http://schemas.openxmlformats.org/drawingml/2006/picture">
                 <pic:pic>
@@ -11759,7 +11652,7 @@
         <w:pStyle w:val="ImageCaption"/>
       </w:pPr>
       <w:r>
-        <w:t xml:space="preserve">Figure 24. MobSF source view of</w:t>
+        <w:t xml:space="preserve">Figure 22. MobSF source view of</w:t>
       </w:r>
       <w:r>
         <w:t xml:space="preserve"> </w:t>
@@ -11783,7 +11676,7 @@
           <wp:inline>
             <wp:extent cx="5334000" cy="3259666"/>
             <wp:effectExtent b="0" l="0" r="0" t="0"/>
-            <wp:docPr descr="Figure 25. MobSF source view of InsecureDataStorage4Activity.java: credentials written to /sdcard/.uinfo.txt – Finding 3." title="" id="124" name="Picture"/>
+            <wp:docPr descr="Figure 23. MobSF source view of InsecureDataStorage4Activity.java: credentials written to /sdcard/.uinfo.txt – Finding 3." title="" id="124" name="Picture"/>
             <a:graphic>
               <a:graphicData uri="http://schemas.openxmlformats.org/drawingml/2006/picture">
                 <pic:pic>
@@ -11826,7 +11719,7 @@
         <w:pStyle w:val="ImageCaption"/>
       </w:pPr>
       <w:r>
-        <w:t xml:space="preserve">Figure 25. MobSF source view of</w:t>
+        <w:t xml:space="preserve">Figure 23. MobSF source view of</w:t>
       </w:r>
       <w:r>
         <w:t xml:space="preserve"> </w:t>
@@ -11865,7 +11758,7 @@
           <wp:inline>
             <wp:extent cx="5334000" cy="3259666"/>
             <wp:effectExtent b="0" l="0" r="0" t="0"/>
-            <wp:docPr descr="Figure 26. MobSF source view of LogActivity.java: credit card number written to logcat with Log.e – Finding 5." title="" id="127" name="Picture"/>
+            <wp:docPr descr="Figure 24. MobSF source view of LogActivity.java: credit card number written to logcat with Log.e – Finding 5." title="" id="127" name="Picture"/>
             <a:graphic>
               <a:graphicData uri="http://schemas.openxmlformats.org/drawingml/2006/picture">
                 <pic:pic>
@@ -11908,7 +11801,7 @@
         <w:pStyle w:val="ImageCaption"/>
       </w:pPr>
       <w:r>
-        <w:t xml:space="preserve">Figure 26. MobSF source view of</w:t>
+        <w:t xml:space="preserve">Figure 24. MobSF source view of</w:t>
       </w:r>
       <w:r>
         <w:t xml:space="preserve"> </w:t>
@@ -11947,7 +11840,7 @@
           <wp:inline>
             <wp:extent cx="5334000" cy="3259666"/>
             <wp:effectExtent b="0" l="0" r="0" t="0"/>
-            <wp:docPr descr="Figure 27. MobSF source view of HardcodeActivity.java: hardcoded key vendorsecretkey, which MobSF did not flag as a secret (false negative, Section 10.6)." title="" id="130" name="Picture"/>
+            <wp:docPr descr="Figure 25. MobSF source view of HardcodeActivity.java: hardcoded key vendorsecretkey, which MobSF did not flag as a secret (false negative, Section 10.6)." title="" id="130" name="Picture"/>
             <a:graphic>
               <a:graphicData uri="http://schemas.openxmlformats.org/drawingml/2006/picture">
                 <pic:pic>
@@ -11990,7 +11883,7 @@
         <w:pStyle w:val="ImageCaption"/>
       </w:pPr>
       <w:r>
-        <w:t xml:space="preserve">Figure 27. MobSF source view of</w:t>
+        <w:t xml:space="preserve">Figure 25. MobSF source view of</w:t>
       </w:r>
       <w:r>
         <w:t xml:space="preserve"> </w:t>
@@ -12026,7 +11919,7 @@
           <wp:inline>
             <wp:extent cx="5334000" cy="4074583"/>
             <wp:effectExtent b="0" l="0" r="0" t="0"/>
-            <wp:docPr descr="Figure 28. Android API usage detected by MobSF (IPC, local file I/O, native code, content provider, start activity)." title="" id="133" name="Picture"/>
+            <wp:docPr descr="Figure 26. Android API usage detected by MobSF (IPC, local file I/O, native code, content provider, start activity)." title="" id="133" name="Picture"/>
             <a:graphic>
               <a:graphicData uri="http://schemas.openxmlformats.org/drawingml/2006/picture">
                 <pic:pic>
@@ -12069,7 +11962,7 @@
         <w:pStyle w:val="ImageCaption"/>
       </w:pPr>
       <w:r>
-        <w:t xml:space="preserve">Figure 28. Android API usage detected by MobSF (IPC, local file I/O, native code, content provider, start activity).</w:t>
+        <w:t xml:space="preserve">Figure 26. Android API usage detected by MobSF (IPC, local file I/O, native code, content provider, start activity).</w:t>
       </w:r>
     </w:p>
     <w:p>
@@ -12081,7 +11974,7 @@
           <wp:inline>
             <wp:extent cx="5334000" cy="4074583"/>
             <wp:effectExtent b="0" l="0" r="0" t="0"/>
-            <wp:docPr descr="Figure 29. Components section of the MobSF report (activities and providers)." title="" id="136" name="Picture"/>
+            <wp:docPr descr="Figure 27. Components section of the MobSF report (activities and providers)." title="" id="136" name="Picture"/>
             <a:graphic>
               <a:graphicData uri="http://schemas.openxmlformats.org/drawingml/2006/picture">
                 <pic:pic>
@@ -12124,7 +12017,7 @@
         <w:pStyle w:val="ImageCaption"/>
       </w:pPr>
       <w:r>
-        <w:t xml:space="preserve">Figure 29. Components section of the MobSF report (activities and providers).</w:t>
+        <w:t xml:space="preserve">Figure 27. Components section of the MobSF report (activities and providers).</w:t>
       </w:r>
     </w:p>
     <w:p>

</xml_diff>